<commit_message>
final report filling out, added reminders
</commit_message>
<xml_diff>
--- a/Python_Server/flask_blog/static/Report/FinalReport.docx
+++ b/Python_Server/flask_blog/static/Report/FinalReport.docx
@@ -399,44 +399,51 @@
       <w:pPr>
         <w:rPr>
           <w:rFonts w:ascii="Times New Roman" w:hAnsi="Times New Roman" w:cs="Times New Roman"/>
+          <w:sz w:val="40"/>
+          <w:szCs w:val="40"/>
+        </w:rPr>
+      </w:pPr>
+      <w:r>
+        <w:rPr>
+          <w:rFonts w:ascii="Times New Roman" w:hAnsi="Times New Roman" w:cs="Times New Roman"/>
+          <w:sz w:val="40"/>
+          <w:szCs w:val="40"/>
+        </w:rPr>
+        <w:t>Objectives &amp; motivation</w:t>
+      </w:r>
+      <w:r>
+        <w:rPr>
+          <w:rFonts w:ascii="Times New Roman" w:hAnsi="Times New Roman" w:cs="Times New Roman"/>
+          <w:sz w:val="40"/>
+          <w:szCs w:val="40"/>
+        </w:rPr>
+        <w:t>:</w:t>
+      </w:r>
+    </w:p>
+    <w:p>
+      <w:pPr>
+        <w:rPr>
+          <w:rFonts w:ascii="Times New Roman" w:hAnsi="Times New Roman" w:cs="Times New Roman"/>
           <w:b/>
           <w:bCs/>
+          <w:color w:val="EE0000"/>
           <w:sz w:val="28"/>
           <w:szCs w:val="28"/>
           <w:u w:val="single"/>
         </w:rPr>
       </w:pPr>
-    </w:p>
-    <w:p>
-      <w:pPr>
+      <w:r>
         <w:rPr>
           <w:rFonts w:ascii="Times New Roman" w:hAnsi="Times New Roman" w:cs="Times New Roman"/>
           <w:b/>
           <w:bCs/>
+          <w:color w:val="EE0000"/>
           <w:sz w:val="28"/>
           <w:szCs w:val="28"/>
           <w:u w:val="single"/>
         </w:rPr>
-      </w:pPr>
-    </w:p>
-    <w:p>
-      <w:pPr>
-        <w:rPr>
-          <w:rFonts w:ascii="Times New Roman" w:hAnsi="Times New Roman" w:cs="Times New Roman"/>
-          <w:b/>
-          <w:bCs/>
-          <w:sz w:val="28"/>
-          <w:szCs w:val="28"/>
-          <w:u w:val="single"/>
-        </w:rPr>
-      </w:pPr>
-    </w:p>
-    <w:p>
-      <w:pPr>
-        <w:rPr>
-          <w:rFonts w:ascii="Times New Roman" w:hAnsi="Times New Roman" w:cs="Times New Roman"/>
-        </w:rPr>
-      </w:pPr>
+        <w:t>Reminder to fill out</w:t>
+      </w:r>
     </w:p>
     <w:p>
       <w:pPr>
@@ -452,43 +459,6 @@
           <w:sz w:val="40"/>
           <w:szCs w:val="40"/>
         </w:rPr>
-        <w:t>Objectives &amp; motivation</w:t>
-      </w:r>
-      <w:r>
-        <w:rPr>
-          <w:rFonts w:ascii="Times New Roman" w:hAnsi="Times New Roman" w:cs="Times New Roman"/>
-          <w:sz w:val="40"/>
-          <w:szCs w:val="40"/>
-        </w:rPr>
-        <w:t>:</w:t>
-      </w:r>
-    </w:p>
-    <w:p>
-      <w:pPr>
-        <w:rPr>
-          <w:rFonts w:ascii="Times New Roman" w:hAnsi="Times New Roman" w:cs="Times New Roman"/>
-          <w:b/>
-          <w:bCs/>
-          <w:sz w:val="28"/>
-          <w:szCs w:val="28"/>
-          <w:u w:val="single"/>
-        </w:rPr>
-      </w:pPr>
-    </w:p>
-    <w:p>
-      <w:pPr>
-        <w:rPr>
-          <w:rFonts w:ascii="Times New Roman" w:hAnsi="Times New Roman" w:cs="Times New Roman"/>
-          <w:sz w:val="40"/>
-          <w:szCs w:val="40"/>
-        </w:rPr>
-      </w:pPr>
-      <w:r>
-        <w:rPr>
-          <w:rFonts w:ascii="Times New Roman" w:hAnsi="Times New Roman" w:cs="Times New Roman"/>
-          <w:sz w:val="40"/>
-          <w:szCs w:val="40"/>
-        </w:rPr>
         <w:t xml:space="preserve">Project Description: </w:t>
       </w:r>
     </w:p>
@@ -537,7 +507,25 @@
           <w:kern w:val="0"/>
           <w14:ligatures w14:val="none"/>
         </w:rPr>
-        <w:t xml:space="preserve"> set up a python3 environment. Use pip to install the following tools:</w:t>
+        <w:t xml:space="preserve"> set up a python3 environment</w:t>
+      </w:r>
+      <w:r>
+        <w:rPr>
+          <w:rFonts w:ascii="Times New Roman" w:eastAsia="Times New Roman" w:hAnsi="Times New Roman" w:cs="Times New Roman"/>
+          <w:color w:val="1F2328"/>
+          <w:kern w:val="0"/>
+          <w14:ligatures w14:val="none"/>
+        </w:rPr>
+        <w:t xml:space="preserve"> with pip.</w:t>
+      </w:r>
+      <w:r>
+        <w:rPr>
+          <w:rFonts w:ascii="Times New Roman" w:eastAsia="Times New Roman" w:hAnsi="Times New Roman" w:cs="Times New Roman"/>
+          <w:color w:val="1F2328"/>
+          <w:kern w:val="0"/>
+          <w14:ligatures w14:val="none"/>
+        </w:rPr>
+        <w:t xml:space="preserve"> Use pip to install the following tools:</w:t>
       </w:r>
     </w:p>
     <w:p>
@@ -1006,7 +994,6 @@
           <w:szCs w:val="24"/>
           <w:bdr w:val="none" w:sz="0" w:space="0" w:color="auto" w:frame="1"/>
         </w:rPr>
-        <w:lastRenderedPageBreak/>
         <w:t>INFO:werkzeug</w:t>
       </w:r>
       <w:proofErr w:type="gramEnd"/>
@@ -1100,20 +1087,161 @@
         <w:rPr>
           <w:rFonts w:ascii="Times New Roman" w:hAnsi="Times New Roman" w:cs="Times New Roman"/>
         </w:rPr>
+        <w:lastRenderedPageBreak/>
         <w:t xml:space="preserve">At this point you should see the homepage. There are three </w:t>
       </w:r>
-    </w:p>
-    <w:p>
-      <w:pPr>
-        <w:rPr>
-          <w:rFonts w:ascii="Times New Roman" w:hAnsi="Times New Roman" w:cs="Times New Roman"/>
-          <w:b/>
-          <w:bCs/>
+      <w:r>
+        <w:rPr>
+          <w:rFonts w:ascii="Times New Roman" w:hAnsi="Times New Roman" w:cs="Times New Roman"/>
+        </w:rPr>
+        <w:t xml:space="preserve">webpages to the server: the homepage, </w:t>
+      </w:r>
+      <w:r>
+        <w:rPr>
+          <w:rFonts w:ascii="Times New Roman" w:hAnsi="Times New Roman" w:cs="Times New Roman"/>
+        </w:rPr>
+        <w:t xml:space="preserve">the hotel booking page (which is password protected) and the hotel monitoring page. The hotel booking page simulates a writer, which is why you need to input permissions to have writer privileges. The username and password are provided via the sticky note set on the homepage (username: </w:t>
+      </w:r>
+      <w:hyperlink r:id="rId6" w:history="1">
+        <w:r>
+          <w:rPr>
+            <w:rStyle w:val="Hyperlink"/>
+            <w:rFonts w:ascii="Times New Roman" w:hAnsi="Times New Roman" w:cs="Times New Roman"/>
+          </w:rPr>
+          <w:t>manager@hotel.com</w:t>
+        </w:r>
+      </w:hyperlink>
+      <w:r>
+        <w:rPr>
+          <w:rFonts w:ascii="Times New Roman" w:hAnsi="Times New Roman" w:cs="Times New Roman"/>
+        </w:rPr>
+        <w:t xml:space="preserve"> password: </w:t>
+      </w:r>
+      <w:proofErr w:type="spellStart"/>
+      <w:r>
+        <w:rPr>
+          <w:rFonts w:ascii="Times New Roman" w:hAnsi="Times New Roman" w:cs="Times New Roman"/>
+        </w:rPr>
+        <w:t>ilovehotels</w:t>
+      </w:r>
+      <w:proofErr w:type="spellEnd"/>
+      <w:r>
+        <w:rPr>
+          <w:rFonts w:ascii="Times New Roman" w:hAnsi="Times New Roman" w:cs="Times New Roman"/>
+        </w:rPr>
+        <w:t xml:space="preserve">). The hotel monitoring page simulates a reader, which is why permissions are not needed. Please note that patience of several seconds is required when loading pages or submitting any input into the server. </w:t>
+      </w:r>
+    </w:p>
+    <w:p>
+      <w:pPr>
+        <w:rPr>
+          <w:rFonts w:ascii="Times New Roman" w:hAnsi="Times New Roman" w:cs="Times New Roman"/>
           <w:sz w:val="28"/>
           <w:szCs w:val="28"/>
-          <w:u w:val="single"/>
-        </w:rPr>
-      </w:pPr>
+        </w:rPr>
+      </w:pPr>
+      <w:r>
+        <w:rPr>
+          <w:rFonts w:ascii="Times New Roman" w:hAnsi="Times New Roman" w:cs="Times New Roman"/>
+          <w:sz w:val="28"/>
+          <w:szCs w:val="28"/>
+        </w:rPr>
+        <w:t xml:space="preserve">Booking Page Description: </w:t>
+      </w:r>
+    </w:p>
+    <w:p>
+      <w:pPr>
+        <w:rPr>
+          <w:rFonts w:ascii="Times New Roman" w:hAnsi="Times New Roman" w:cs="Times New Roman"/>
+        </w:rPr>
+      </w:pPr>
+      <w:r>
+        <w:rPr>
+          <w:rFonts w:ascii="Times New Roman" w:hAnsi="Times New Roman" w:cs="Times New Roman"/>
+        </w:rPr>
+        <w:t xml:space="preserve">Here you may select one of five rooms to book in the hotel, and </w:t>
+      </w:r>
+      <w:r>
+        <w:rPr>
+          <w:rFonts w:ascii="Times New Roman" w:hAnsi="Times New Roman" w:cs="Times New Roman"/>
+        </w:rPr>
+        <w:t xml:space="preserve">the length of time you would like to book the room in seconds. </w:t>
+      </w:r>
+      <w:r>
+        <w:rPr>
+          <w:rFonts w:ascii="Times New Roman" w:hAnsi="Times New Roman" w:cs="Times New Roman"/>
+        </w:rPr>
+        <w:t xml:space="preserve">If you try to book a room that is already currently booked by either the automated writers or by having previously booked with this page, you will be redirected to the home page with a message in red that says “That room is already booked! Please try again.” </w:t>
+      </w:r>
+    </w:p>
+    <w:p>
+      <w:pPr>
+        <w:rPr>
+          <w:rFonts w:ascii="Times New Roman" w:hAnsi="Times New Roman" w:cs="Times New Roman"/>
+          <w:sz w:val="28"/>
+          <w:szCs w:val="28"/>
+        </w:rPr>
+      </w:pPr>
+      <w:r>
+        <w:rPr>
+          <w:rFonts w:ascii="Times New Roman" w:hAnsi="Times New Roman" w:cs="Times New Roman"/>
+          <w:sz w:val="28"/>
+          <w:szCs w:val="28"/>
+        </w:rPr>
+        <w:t xml:space="preserve">Hotel Monitoring Page Description: </w:t>
+      </w:r>
+    </w:p>
+    <w:p>
+      <w:pPr>
+        <w:rPr>
+          <w:rFonts w:ascii="Times New Roman" w:hAnsi="Times New Roman" w:cs="Times New Roman"/>
+        </w:rPr>
+      </w:pPr>
+      <w:r>
+        <w:rPr>
+          <w:rFonts w:ascii="Times New Roman" w:hAnsi="Times New Roman" w:cs="Times New Roman"/>
+        </w:rPr>
+        <w:t xml:space="preserve">Here you may view the current status of all hotel bookings. </w:t>
+      </w:r>
+      <w:r>
+        <w:rPr>
+          <w:rFonts w:ascii="Times New Roman" w:hAnsi="Times New Roman" w:cs="Times New Roman"/>
+        </w:rPr>
+        <w:t xml:space="preserve">Under ‘actions,’ you may ‘test readers and writers.’ This generates 10 readers and 5 writers on the backend to simulate multiple simultaneous database clients. The writers create one booking for each type of room for a random number of seconds between 20 and 40. You may also disconnect. This disconnects the socket, but does not give a message, since it cannot once it’s disconnected. </w:t>
+      </w:r>
+      <w:r>
+        <w:rPr>
+          <w:rFonts w:ascii="Times New Roman" w:hAnsi="Times New Roman" w:cs="Times New Roman"/>
+        </w:rPr>
+        <w:br/>
+      </w:r>
+    </w:p>
+    <w:p>
+      <w:pPr>
+        <w:rPr>
+          <w:rFonts w:ascii="Times New Roman" w:hAnsi="Times New Roman" w:cs="Times New Roman"/>
+        </w:rPr>
+      </w:pPr>
+      <w:r>
+        <w:rPr>
+          <w:rFonts w:ascii="Times New Roman" w:hAnsi="Times New Roman" w:cs="Times New Roman"/>
+        </w:rPr>
+        <w:t xml:space="preserve">Underneath actions, there is the connection log. This gives test messages showing that the socket has connected. On the right is the main purpose of the page: hotel bookings. Here, there is a message showing the values of the database that generates every 2 or 3 seconds (this is randomly decided by a </w:t>
+      </w:r>
+      <w:proofErr w:type="gramStart"/>
+      <w:r>
+        <w:rPr>
+          <w:rFonts w:ascii="Times New Roman" w:hAnsi="Times New Roman" w:cs="Times New Roman"/>
+        </w:rPr>
+        <w:t>sleep(</w:t>
+      </w:r>
+      <w:proofErr w:type="gramEnd"/>
+      <w:r>
+        <w:rPr>
+          <w:rFonts w:ascii="Times New Roman" w:hAnsi="Times New Roman" w:cs="Times New Roman"/>
+        </w:rPr>
+        <w:t xml:space="preserve">) function).  </w:t>
+      </w:r>
     </w:p>
     <w:p>
       <w:pPr>
@@ -1193,7 +1321,14 @@
         <w:rPr>
           <w:color w:val="1F2328"/>
         </w:rPr>
-        <w:t>s a permanent, bi-directional communication over a transmission control protocol (TCP) connection. SocketIO was a core component of this setup which allowed the use of multiple readers and writers while viewing a single webpage instance.</w:t>
+        <w:t xml:space="preserve">s a permanent, bi-directional communication over a transmission control protocol (TCP) connection. SocketIO was a core </w:t>
+      </w:r>
+      <w:r>
+        <w:rPr>
+          <w:color w:val="1F2328"/>
+        </w:rPr>
+        <w:lastRenderedPageBreak/>
+        <w:t>component of this setup which allowed the use of multiple readers and writers while viewing a single webpage instance.</w:t>
       </w:r>
     </w:p>
     <w:p>
@@ -1204,37 +1339,130 @@
           <w:szCs w:val="40"/>
         </w:rPr>
       </w:pPr>
-    </w:p>
-    <w:p>
-      <w:pPr>
+      <w:r>
         <w:rPr>
           <w:rFonts w:ascii="Times New Roman" w:hAnsi="Times New Roman" w:cs="Times New Roman"/>
           <w:sz w:val="40"/>
           <w:szCs w:val="40"/>
         </w:rPr>
-      </w:pPr>
-      <w:r>
+        <w:t xml:space="preserve">Group Member Distribution: </w:t>
+      </w:r>
+    </w:p>
+    <w:p>
+      <w:pPr>
+        <w:shd w:val="clear" w:color="auto" w:fill="FFFFFF"/>
+        <w:spacing w:after="240" w:line="240" w:lineRule="auto"/>
+        <w:rPr>
+          <w:rFonts w:ascii="Times New Roman" w:eastAsia="Times New Roman" w:hAnsi="Times New Roman" w:cs="Times New Roman"/>
+          <w:color w:val="1F2328"/>
+          <w:kern w:val="0"/>
+          <w:sz w:val="28"/>
+          <w:szCs w:val="28"/>
+          <w14:ligatures w14:val="none"/>
+        </w:rPr>
+      </w:pPr>
+      <w:r>
+        <w:rPr>
+          <w:rFonts w:ascii="Times New Roman" w:eastAsia="Times New Roman" w:hAnsi="Times New Roman" w:cs="Times New Roman"/>
+          <w:color w:val="1F2328"/>
+          <w:kern w:val="0"/>
+          <w:sz w:val="28"/>
+          <w:szCs w:val="28"/>
+          <w14:ligatures w14:val="none"/>
+        </w:rPr>
+        <w:t>Wilson’s Role</w:t>
+      </w:r>
+    </w:p>
+    <w:p>
+      <w:pPr>
+        <w:shd w:val="clear" w:color="auto" w:fill="FFFFFF"/>
+        <w:spacing w:after="240" w:line="240" w:lineRule="auto"/>
+        <w:rPr>
+          <w:rFonts w:ascii="Times New Roman" w:eastAsia="Times New Roman" w:hAnsi="Times New Roman" w:cs="Times New Roman"/>
+          <w:color w:val="1F2328"/>
+          <w:kern w:val="0"/>
+          <w14:ligatures w14:val="none"/>
+        </w:rPr>
+      </w:pPr>
+      <w:r>
+        <w:rPr>
+          <w:rFonts w:ascii="Times New Roman" w:eastAsia="Times New Roman" w:hAnsi="Times New Roman" w:cs="Times New Roman"/>
+          <w:color w:val="1F2328"/>
+          <w:kern w:val="0"/>
+          <w14:ligatures w14:val="none"/>
+        </w:rPr>
+        <w:t>Primarily worked on the setup of the web server. This included setting up the flask environment using SQLAlchemy to create a database to hold the hotel booking data, setting up communication with SocketIO so that live changes could be made, and setting up all webpages. She set up the booking webpage to create changes to the database and mark the hotels as booked, and the reader page which regularly queries the database for the latest data on all hotel bookings.</w:t>
+      </w:r>
+    </w:p>
+    <w:p>
+      <w:pPr>
+        <w:shd w:val="clear" w:color="auto" w:fill="FFFFFF"/>
+        <w:spacing w:before="360" w:after="240" w:line="240" w:lineRule="auto"/>
+        <w:outlineLvl w:val="1"/>
+        <w:rPr>
+          <w:rFonts w:ascii="Times New Roman" w:eastAsia="Times New Roman" w:hAnsi="Times New Roman" w:cs="Times New Roman"/>
+          <w:color w:val="1F2328"/>
+          <w:kern w:val="0"/>
+          <w:sz w:val="28"/>
+          <w:szCs w:val="28"/>
+          <w14:ligatures w14:val="none"/>
+        </w:rPr>
+      </w:pPr>
+      <w:r>
+        <w:rPr>
+          <w:rFonts w:ascii="Times New Roman" w:eastAsia="Times New Roman" w:hAnsi="Times New Roman" w:cs="Times New Roman"/>
+          <w:color w:val="1F2328"/>
+          <w:kern w:val="0"/>
+          <w:sz w:val="28"/>
+          <w:szCs w:val="28"/>
+          <w14:ligatures w14:val="none"/>
+        </w:rPr>
+        <w:t>Ian's Role:</w:t>
+      </w:r>
+    </w:p>
+    <w:p>
+      <w:pPr>
+        <w:shd w:val="clear" w:color="auto" w:fill="FFFFFF"/>
+        <w:spacing w:after="240" w:line="240" w:lineRule="auto"/>
+        <w:rPr>
+          <w:rFonts w:ascii="Times New Roman" w:eastAsia="Times New Roman" w:hAnsi="Times New Roman" w:cs="Times New Roman"/>
+          <w:color w:val="1F2328"/>
+          <w:kern w:val="0"/>
+          <w14:ligatures w14:val="none"/>
+        </w:rPr>
+      </w:pPr>
+      <w:r>
+        <w:rPr>
+          <w:rFonts w:ascii="Times New Roman" w:eastAsia="Times New Roman" w:hAnsi="Times New Roman" w:cs="Times New Roman"/>
+          <w:color w:val="1F2328"/>
+          <w:kern w:val="0"/>
+          <w14:ligatures w14:val="none"/>
+        </w:rPr>
+        <w:t>Primarily worked on implementation of reader and writer logic and proper usage and synchronization of readers and writers. Set up a Test Readers and Writers button to generate 10 readers and a writer for each room for demonstration of simulated logic. Add usage of readers and writers to relevant functions of the web server with readers threads generated whenever a read operation is sent to the database to retrieve room information and writer threads when a booking is made with an update operation.</w:t>
+      </w:r>
+    </w:p>
+    <w:p>
+      <w:pPr>
         <w:rPr>
           <w:rFonts w:ascii="Times New Roman" w:hAnsi="Times New Roman" w:cs="Times New Roman"/>
           <w:sz w:val="40"/>
           <w:szCs w:val="40"/>
         </w:rPr>
-        <w:t xml:space="preserve">Challenges and Problems Met: </w:t>
-      </w:r>
-    </w:p>
-    <w:p>
-      <w:pPr>
+      </w:pPr>
+      <w:r>
         <w:rPr>
           <w:rFonts w:ascii="Times New Roman" w:hAnsi="Times New Roman" w:cs="Times New Roman"/>
           <w:sz w:val="40"/>
           <w:szCs w:val="40"/>
         </w:rPr>
-      </w:pPr>
-    </w:p>
-    <w:p>
-      <w:pPr>
-        <w:rPr>
-          <w:rFonts w:ascii="Times New Roman" w:hAnsi="Times New Roman" w:cs="Times New Roman"/>
+        <w:t xml:space="preserve">Challenges and Problems Met: </w:t>
+      </w:r>
+    </w:p>
+    <w:p>
+      <w:pPr>
+        <w:rPr>
+          <w:rFonts w:ascii="Times New Roman" w:hAnsi="Times New Roman" w:cs="Times New Roman"/>
+          <w:color w:val="EE0000"/>
           <w:sz w:val="40"/>
           <w:szCs w:val="40"/>
         </w:rPr>
@@ -1242,10 +1470,11 @@
       <w:r>
         <w:rPr>
           <w:rFonts w:ascii="Times New Roman" w:hAnsi="Times New Roman" w:cs="Times New Roman"/>
+          <w:color w:val="EE0000"/>
           <w:sz w:val="40"/>
           <w:szCs w:val="40"/>
         </w:rPr>
-        <w:t>Experimental Setting:</w:t>
+        <w:t>reminder</w:t>
       </w:r>
     </w:p>
     <w:p>
@@ -1262,13 +1491,14 @@
           <w:sz w:val="40"/>
           <w:szCs w:val="40"/>
         </w:rPr>
-        <w:t xml:space="preserve">Results Analysis: </w:t>
-      </w:r>
-    </w:p>
-    <w:p>
-      <w:pPr>
-        <w:rPr>
-          <w:rFonts w:ascii="Times New Roman" w:hAnsi="Times New Roman" w:cs="Times New Roman"/>
+        <w:t>Experimental Setting:</w:t>
+      </w:r>
+    </w:p>
+    <w:p>
+      <w:pPr>
+        <w:rPr>
+          <w:rFonts w:ascii="Times New Roman" w:hAnsi="Times New Roman" w:cs="Times New Roman"/>
+          <w:color w:val="EE0000"/>
           <w:sz w:val="40"/>
           <w:szCs w:val="40"/>
         </w:rPr>
@@ -1276,10 +1506,11 @@
       <w:r>
         <w:rPr>
           <w:rFonts w:ascii="Times New Roman" w:hAnsi="Times New Roman" w:cs="Times New Roman"/>
+          <w:color w:val="EE0000"/>
           <w:sz w:val="40"/>
           <w:szCs w:val="40"/>
         </w:rPr>
-        <w:t xml:space="preserve">Future Work: </w:t>
+        <w:t>reminder</w:t>
       </w:r>
     </w:p>
     <w:p>
@@ -1296,30 +1527,30 @@
           <w:sz w:val="40"/>
           <w:szCs w:val="40"/>
         </w:rPr>
-        <w:t xml:space="preserve">Group Member Distribution: </w:t>
-      </w:r>
-    </w:p>
-    <w:p>
-      <w:pPr>
-        <w:rPr>
-          <w:rFonts w:ascii="Times New Roman" w:hAnsi="Times New Roman" w:cs="Times New Roman"/>
+        <w:t xml:space="preserve">Results Analysis: </w:t>
+      </w:r>
+    </w:p>
+    <w:p>
+      <w:pPr>
+        <w:rPr>
+          <w:rFonts w:ascii="Times New Roman" w:hAnsi="Times New Roman" w:cs="Times New Roman"/>
+          <w:color w:val="EE0000"/>
           <w:sz w:val="40"/>
           <w:szCs w:val="40"/>
         </w:rPr>
       </w:pPr>
-    </w:p>
-    <w:p>
-      <w:pPr>
-        <w:rPr>
-          <w:rFonts w:ascii="Times New Roman" w:hAnsi="Times New Roman" w:cs="Times New Roman"/>
+      <w:r>
+        <w:rPr>
+          <w:rFonts w:ascii="Times New Roman" w:hAnsi="Times New Roman" w:cs="Times New Roman"/>
+          <w:color w:val="EE0000"/>
           <w:sz w:val="40"/>
           <w:szCs w:val="40"/>
         </w:rPr>
-      </w:pPr>
-    </w:p>
-    <w:p>
-      <w:pPr>
-        <w:jc w:val="center"/>
+        <w:t>reminder</w:t>
+      </w:r>
+    </w:p>
+    <w:p>
+      <w:pPr>
         <w:rPr>
           <w:rFonts w:ascii="Times New Roman" w:hAnsi="Times New Roman" w:cs="Times New Roman"/>
           <w:sz w:val="40"/>
@@ -1332,6 +1563,62 @@
           <w:sz w:val="40"/>
           <w:szCs w:val="40"/>
         </w:rPr>
+        <w:t xml:space="preserve">Future Work: </w:t>
+      </w:r>
+    </w:p>
+    <w:p>
+      <w:pPr>
+        <w:rPr>
+          <w:rFonts w:ascii="Times New Roman" w:hAnsi="Times New Roman" w:cs="Times New Roman"/>
+          <w:color w:val="EE0000"/>
+          <w:sz w:val="40"/>
+          <w:szCs w:val="40"/>
+        </w:rPr>
+      </w:pPr>
+      <w:r>
+        <w:rPr>
+          <w:rFonts w:ascii="Times New Roman" w:hAnsi="Times New Roman" w:cs="Times New Roman"/>
+          <w:color w:val="EE0000"/>
+          <w:sz w:val="40"/>
+          <w:szCs w:val="40"/>
+        </w:rPr>
+        <w:t>reminder</w:t>
+      </w:r>
+    </w:p>
+    <w:p>
+      <w:pPr>
+        <w:rPr>
+          <w:rFonts w:ascii="Times New Roman" w:hAnsi="Times New Roman" w:cs="Times New Roman"/>
+          <w:sz w:val="40"/>
+          <w:szCs w:val="40"/>
+        </w:rPr>
+      </w:pPr>
+    </w:p>
+    <w:p>
+      <w:pPr>
+        <w:rPr>
+          <w:rFonts w:ascii="Times New Roman" w:hAnsi="Times New Roman" w:cs="Times New Roman"/>
+          <w:sz w:val="40"/>
+          <w:szCs w:val="40"/>
+        </w:rPr>
+      </w:pPr>
+    </w:p>
+    <w:p>
+      <w:pPr>
+        <w:jc w:val="center"/>
+        <w:rPr>
+          <w:rFonts w:ascii="Times New Roman" w:hAnsi="Times New Roman" w:cs="Times New Roman"/>
+          <w:sz w:val="40"/>
+          <w:szCs w:val="40"/>
+        </w:rPr>
+      </w:pPr>
+      <w:r>
+        <w:rPr>
+          <w:rFonts w:ascii="Times New Roman" w:hAnsi="Times New Roman" w:cs="Times New Roman"/>
+          <w:sz w:val="40"/>
+          <w:szCs w:val="40"/>
+        </w:rPr>
+        <w:lastRenderedPageBreak/>
         <w:t>References</w:t>
       </w:r>
     </w:p>
@@ -2466,16 +2753,7 @@
                 <w:kern w:val="0"/>
                 <w14:ligatures w14:val="none"/>
               </w:rPr>
-              <w:t xml:space="preserve">. Retrieved 2026 from </w:t>
-            </w:r>
-            <w:r>
-              <w:rPr>
-                <w:rFonts w:ascii="Times New Roman" w:eastAsia="Times New Roman" w:hAnsi="Times New Roman" w:cs="Times New Roman"/>
-                <w:kern w:val="0"/>
-                <w14:ligatures w14:val="none"/>
-              </w:rPr>
-              <w:lastRenderedPageBreak/>
-              <w:t>https://community.intersystems.com/post/flask-and-flask-login-guide-building-secure-web-applications</w:t>
+              <w:t>. Retrieved 2026 from https://community.intersystems.com/post/flask-and-flask-login-guide-building-secure-web-applications</w:t>
             </w:r>
           </w:p>
         </w:tc>
@@ -2496,8 +2774,8 @@
       </w:pPr>
     </w:p>
     <w:sectPr>
-      <w:footerReference w:type="even" r:id="rId6"/>
-      <w:footerReference w:type="default" r:id="rId7"/>
+      <w:footerReference w:type="even" r:id="rId7"/>
+      <w:footerReference w:type="default" r:id="rId8"/>
       <w:pgSz w:w="12240" w:h="15840"/>
       <w:pgMar w:top="1440" w:right="1440" w:bottom="1440" w:left="1440" w:header="720" w:footer="720" w:gutter="0"/>
       <w:cols w:space="720"/>
@@ -3108,7 +3386,6 @@
     <w:next w:val="Normal"/>
     <w:link w:val="Heading2Char"/>
     <w:uiPriority w:val="9"/>
-    <w:semiHidden/>
     <w:unhideWhenUsed/>
     <w:qFormat/>
     <w:rsid w:val="00ED44F4"/>
@@ -3325,7 +3602,6 @@
     <w:basedOn w:val="DefaultParagraphFont"/>
     <w:link w:val="Heading2"/>
     <w:uiPriority w:val="9"/>
-    <w:semiHidden/>
     <w:rsid w:val="00ED44F4"/>
     <w:rPr>
       <w:rFonts w:asciiTheme="majorHAnsi" w:eastAsiaTheme="majorEastAsia" w:hAnsiTheme="majorHAnsi" w:cstheme="majorBidi"/>
@@ -3654,7 +3930,6 @@
     <w:name w:val="Normal (Web)"/>
     <w:basedOn w:val="Normal"/>
     <w:uiPriority w:val="99"/>
-    <w:semiHidden/>
     <w:unhideWhenUsed/>
     <w:rsid w:val="008651D0"/>
     <w:pPr>
@@ -3729,6 +4004,29 @@
       <w:rFonts w:ascii="Courier New" w:eastAsia="Times New Roman" w:hAnsi="Courier New" w:cs="Courier New"/>
       <w:sz w:val="20"/>
       <w:szCs w:val="20"/>
+    </w:rPr>
+  </w:style>
+  <w:style w:type="character" w:styleId="Hyperlink">
+    <w:name w:val="Hyperlink"/>
+    <w:basedOn w:val="DefaultParagraphFont"/>
+    <w:uiPriority w:val="99"/>
+    <w:unhideWhenUsed/>
+    <w:rsid w:val="00FF12EF"/>
+    <w:rPr>
+      <w:color w:val="467886" w:themeColor="hyperlink"/>
+      <w:u w:val="single"/>
+    </w:rPr>
+  </w:style>
+  <w:style w:type="character" w:styleId="UnresolvedMention">
+    <w:name w:val="Unresolved Mention"/>
+    <w:basedOn w:val="DefaultParagraphFont"/>
+    <w:uiPriority w:val="99"/>
+    <w:semiHidden/>
+    <w:unhideWhenUsed/>
+    <w:rsid w:val="00FF12EF"/>
+    <w:rPr>
+      <w:color w:val="605E5C"/>
+      <w:shd w:val="clear" w:color="auto" w:fill="E1DFDD"/>
     </w:rPr>
   </w:style>
 </w:styles>

</xml_diff>

<commit_message>
finished my part of report
</commit_message>
<xml_diff>
--- a/Python_Server/flask_blog/static/Report/FinalReport.docx
+++ b/Python_Server/flask_blog/static/Report/FinalReport.docx
@@ -634,8 +634,20 @@
           <w14:ligatures w14:val="none"/>
         </w:rPr>
         <w:lastRenderedPageBreak/>
-        <w:t>pip install flask_sqlalchemy</w:t>
-      </w:r>
+        <w:t xml:space="preserve">pip install </w:t>
+      </w:r>
+      <w:proofErr w:type="spellStart"/>
+      <w:r>
+        <w:rPr>
+          <w:rFonts w:ascii="Times New Roman" w:eastAsia="Times New Roman" w:hAnsi="Times New Roman" w:cs="Times New Roman"/>
+          <w:color w:val="1F2328"/>
+          <w:kern w:val="0"/>
+          <w:bdr w:val="none" w:sz="0" w:space="0" w:color="auto" w:frame="1"/>
+          <w14:ligatures w14:val="none"/>
+        </w:rPr>
+        <w:t>flask_sqlalchemy</w:t>
+      </w:r>
+      <w:proofErr w:type="spellEnd"/>
     </w:p>
     <w:p>
       <w:pPr>
@@ -675,8 +687,20 @@
           <w:bdr w:val="none" w:sz="0" w:space="0" w:color="auto" w:frame="1"/>
           <w14:ligatures w14:val="none"/>
         </w:rPr>
-        <w:t>pip install flask_security</w:t>
-      </w:r>
+        <w:t xml:space="preserve">pip install </w:t>
+      </w:r>
+      <w:proofErr w:type="spellStart"/>
+      <w:r>
+        <w:rPr>
+          <w:rFonts w:ascii="Times New Roman" w:eastAsia="Times New Roman" w:hAnsi="Times New Roman" w:cs="Times New Roman"/>
+          <w:color w:val="1F2328"/>
+          <w:kern w:val="0"/>
+          <w:bdr w:val="none" w:sz="0" w:space="0" w:color="auto" w:frame="1"/>
+          <w14:ligatures w14:val="none"/>
+        </w:rPr>
+        <w:t>flask_security</w:t>
+      </w:r>
+      <w:proofErr w:type="spellEnd"/>
     </w:p>
     <w:p>
       <w:pPr>
@@ -716,8 +740,20 @@
           <w:bdr w:val="none" w:sz="0" w:space="0" w:color="auto" w:frame="1"/>
           <w14:ligatures w14:val="none"/>
         </w:rPr>
-        <w:t>pip install flask_socketio</w:t>
-      </w:r>
+        <w:t xml:space="preserve">pip install </w:t>
+      </w:r>
+      <w:proofErr w:type="spellStart"/>
+      <w:r>
+        <w:rPr>
+          <w:rFonts w:ascii="Times New Roman" w:eastAsia="Times New Roman" w:hAnsi="Times New Roman" w:cs="Times New Roman"/>
+          <w:color w:val="1F2328"/>
+          <w:kern w:val="0"/>
+          <w:bdr w:val="none" w:sz="0" w:space="0" w:color="auto" w:frame="1"/>
+          <w14:ligatures w14:val="none"/>
+        </w:rPr>
+        <w:t>flask_socketio</w:t>
+      </w:r>
+      <w:proofErr w:type="spellEnd"/>
     </w:p>
     <w:p>
       <w:pPr>
@@ -790,7 +826,27 @@
           <w:kern w:val="0"/>
           <w14:ligatures w14:val="none"/>
         </w:rPr>
-        <w:t>Finally, navigate to the flask_blog/ directory and run the following command:</w:t>
+        <w:t xml:space="preserve">Finally, navigate to the </w:t>
+      </w:r>
+      <w:proofErr w:type="spellStart"/>
+      <w:r>
+        <w:rPr>
+          <w:rFonts w:ascii="Times New Roman" w:eastAsia="Times New Roman" w:hAnsi="Times New Roman" w:cs="Times New Roman"/>
+          <w:color w:val="1F2328"/>
+          <w:kern w:val="0"/>
+          <w14:ligatures w14:val="none"/>
+        </w:rPr>
+        <w:t>flask_blog</w:t>
+      </w:r>
+      <w:proofErr w:type="spellEnd"/>
+      <w:r>
+        <w:rPr>
+          <w:rFonts w:ascii="Times New Roman" w:eastAsia="Times New Roman" w:hAnsi="Times New Roman" w:cs="Times New Roman"/>
+          <w:color w:val="1F2328"/>
+          <w:kern w:val="0"/>
+          <w14:ligatures w14:val="none"/>
+        </w:rPr>
+        <w:t>/ directory and run the following command:</w:t>
       </w:r>
     </w:p>
     <w:p>
@@ -869,6 +925,8 @@
           <w:bdr w:val="none" w:sz="0" w:space="0" w:color="auto" w:frame="1"/>
         </w:rPr>
       </w:pPr>
+      <w:proofErr w:type="spellStart"/>
+      <w:proofErr w:type="gramStart"/>
       <w:r>
         <w:rPr>
           <w:rStyle w:val="HTMLCode"/>
@@ -878,13 +936,10 @@
           <w:szCs w:val="24"/>
           <w:bdr w:val="none" w:sz="0" w:space="0" w:color="auto" w:frame="1"/>
         </w:rPr>
-        <w:t>INFO:werkzeug:WARNING: This is a development server. Do not use it in a production deployment. Use a production WSGI server instead.</w:t>
-      </w:r>
-    </w:p>
-    <w:p>
-      <w:pPr>
-        <w:pStyle w:val="HTMLPreformatted"/>
-        <w:shd w:val="clear" w:color="auto" w:fill="F6F8FA"/>
+        <w:t>INFO:werkzeug</w:t>
+      </w:r>
+      <w:proofErr w:type="gramEnd"/>
+      <w:r>
         <w:rPr>
           <w:rStyle w:val="HTMLCode"/>
           <w:rFonts w:ascii="Times New Roman" w:hAnsi="Times New Roman" w:cs="Times New Roman"/>
@@ -893,7 +948,9 @@
           <w:szCs w:val="24"/>
           <w:bdr w:val="none" w:sz="0" w:space="0" w:color="auto" w:frame="1"/>
         </w:rPr>
-      </w:pPr>
+        <w:t>:WARNING</w:t>
+      </w:r>
+      <w:proofErr w:type="spellEnd"/>
       <w:r>
         <w:rPr>
           <w:rStyle w:val="HTMLCode"/>
@@ -903,7 +960,7 @@
           <w:szCs w:val="24"/>
           <w:bdr w:val="none" w:sz="0" w:space="0" w:color="auto" w:frame="1"/>
         </w:rPr>
-        <w:t xml:space="preserve"> * Running on http://127.0.0.1:8080</w:t>
+        <w:t>: This is a development server. Do not use it in a production deployment. Use a production WSGI server instead.</w:t>
       </w:r>
     </w:p>
     <w:p>
@@ -928,7 +985,58 @@
           <w:szCs w:val="24"/>
           <w:bdr w:val="none" w:sz="0" w:space="0" w:color="auto" w:frame="1"/>
         </w:rPr>
-        <w:t>INFO:werkzeug:Press CTRL+C to quit</w:t>
+        <w:t xml:space="preserve"> * Running on http://127.0.0.1:8080</w:t>
+      </w:r>
+    </w:p>
+    <w:p>
+      <w:pPr>
+        <w:pStyle w:val="HTMLPreformatted"/>
+        <w:shd w:val="clear" w:color="auto" w:fill="F6F8FA"/>
+        <w:rPr>
+          <w:rStyle w:val="HTMLCode"/>
+          <w:rFonts w:ascii="Times New Roman" w:hAnsi="Times New Roman" w:cs="Times New Roman"/>
+          <w:color w:val="1F2328"/>
+          <w:sz w:val="24"/>
+          <w:szCs w:val="24"/>
+          <w:bdr w:val="none" w:sz="0" w:space="0" w:color="auto" w:frame="1"/>
+        </w:rPr>
+      </w:pPr>
+      <w:proofErr w:type="spellStart"/>
+      <w:proofErr w:type="gramStart"/>
+      <w:r>
+        <w:rPr>
+          <w:rStyle w:val="HTMLCode"/>
+          <w:rFonts w:ascii="Times New Roman" w:hAnsi="Times New Roman" w:cs="Times New Roman"/>
+          <w:color w:val="1F2328"/>
+          <w:sz w:val="24"/>
+          <w:szCs w:val="24"/>
+          <w:bdr w:val="none" w:sz="0" w:space="0" w:color="auto" w:frame="1"/>
+        </w:rPr>
+        <w:t>INFO:werkzeug</w:t>
+      </w:r>
+      <w:proofErr w:type="gramEnd"/>
+      <w:r>
+        <w:rPr>
+          <w:rStyle w:val="HTMLCode"/>
+          <w:rFonts w:ascii="Times New Roman" w:hAnsi="Times New Roman" w:cs="Times New Roman"/>
+          <w:color w:val="1F2328"/>
+          <w:sz w:val="24"/>
+          <w:szCs w:val="24"/>
+          <w:bdr w:val="none" w:sz="0" w:space="0" w:color="auto" w:frame="1"/>
+        </w:rPr>
+        <w:t>:Press</w:t>
+      </w:r>
+      <w:proofErr w:type="spellEnd"/>
+      <w:r>
+        <w:rPr>
+          <w:rStyle w:val="HTMLCode"/>
+          <w:rFonts w:ascii="Times New Roman" w:hAnsi="Times New Roman" w:cs="Times New Roman"/>
+          <w:color w:val="1F2328"/>
+          <w:sz w:val="24"/>
+          <w:szCs w:val="24"/>
+          <w:bdr w:val="none" w:sz="0" w:space="0" w:color="auto" w:frame="1"/>
+        </w:rPr>
+        <w:t xml:space="preserve"> CTRL+C to quit</w:t>
       </w:r>
     </w:p>
     <w:p>
@@ -1024,7 +1132,21 @@
         <w:rPr>
           <w:rFonts w:ascii="Times New Roman" w:hAnsi="Times New Roman" w:cs="Times New Roman"/>
         </w:rPr>
-        <w:t xml:space="preserve"> password: ilovehotels). The hotel monitoring page simulates a reader, which is why permissions are not needed. Please note that patience of several seconds is required when loading pages or submitting any input into the server. </w:t>
+        <w:t xml:space="preserve"> password: </w:t>
+      </w:r>
+      <w:proofErr w:type="spellStart"/>
+      <w:r>
+        <w:rPr>
+          <w:rFonts w:ascii="Times New Roman" w:hAnsi="Times New Roman" w:cs="Times New Roman"/>
+        </w:rPr>
+        <w:t>ilovehotels</w:t>
+      </w:r>
+      <w:proofErr w:type="spellEnd"/>
+      <w:r>
+        <w:rPr>
+          <w:rFonts w:ascii="Times New Roman" w:hAnsi="Times New Roman" w:cs="Times New Roman"/>
+        </w:rPr>
+        <w:t xml:space="preserve">). The hotel monitoring page simulates a reader, which is why permissions are not needed. Please note that patience of several seconds is required when loading pages or submitting any input into the server. </w:t>
       </w:r>
     </w:p>
     <w:p>
@@ -1128,7 +1250,21 @@
         <w:rPr>
           <w:rFonts w:ascii="Times New Roman" w:hAnsi="Times New Roman" w:cs="Times New Roman"/>
         </w:rPr>
-        <w:t xml:space="preserve">Underneath actions, there is the connection log. This gives test messages showing that the socket has connected. On the right is the main purpose of the page: hotel bookings. Here, there is a message showing the values of the database that generates every 2 or 3 seconds (this is randomly decided by a sleep() function).  </w:t>
+        <w:t xml:space="preserve">Underneath actions, there is the connection log. This gives test messages showing that the socket has connected. On the right is the main purpose of the page: hotel bookings. Here, there is a message showing the values of the database that generates every 2 or 3 seconds (this is randomly decided by a </w:t>
+      </w:r>
+      <w:proofErr w:type="gramStart"/>
+      <w:r>
+        <w:rPr>
+          <w:rFonts w:ascii="Times New Roman" w:hAnsi="Times New Roman" w:cs="Times New Roman"/>
+        </w:rPr>
+        <w:t>sleep(</w:t>
+      </w:r>
+      <w:proofErr w:type="gramEnd"/>
+      <w:r>
+        <w:rPr>
+          <w:rFonts w:ascii="Times New Roman" w:hAnsi="Times New Roman" w:cs="Times New Roman"/>
+        </w:rPr>
+        <w:t xml:space="preserve">) function).  </w:t>
       </w:r>
     </w:p>
     <w:p>
@@ -1197,7 +1333,35 @@
         <w:rPr>
           <w:color w:val="1F2328"/>
         </w:rPr>
-        <w:t>The general framework uses Python and the Web Server Gateway Interface (WSGI) web application framework known as Flask. The database setup used SQLAlchemy, an Object Relational Mapper (ORM) for using SQL databases with Python. For live views and changes to the database, Flasks own module SocketIO was used, which creat</w:t>
+        <w:t xml:space="preserve">The general framework uses Python and the Web Server Gateway Interface (WSGI) web application framework known as Flask. The database setup used </w:t>
+      </w:r>
+      <w:proofErr w:type="spellStart"/>
+      <w:r>
+        <w:rPr>
+          <w:color w:val="1F2328"/>
+        </w:rPr>
+        <w:t>SQLAlchemy</w:t>
+      </w:r>
+      <w:proofErr w:type="spellEnd"/>
+      <w:r>
+        <w:rPr>
+          <w:color w:val="1F2328"/>
+        </w:rPr>
+        <w:t xml:space="preserve">, an Object Relational Mapper (ORM) for using SQL databases with Python. For live views and changes to the database, Flasks own module </w:t>
+      </w:r>
+      <w:proofErr w:type="spellStart"/>
+      <w:r>
+        <w:rPr>
+          <w:color w:val="1F2328"/>
+        </w:rPr>
+        <w:t>SocketIO</w:t>
+      </w:r>
+      <w:proofErr w:type="spellEnd"/>
+      <w:r>
+        <w:rPr>
+          <w:color w:val="1F2328"/>
+        </w:rPr>
+        <w:t xml:space="preserve"> was used, which creat</w:t>
       </w:r>
       <w:r>
         <w:rPr>
@@ -1209,7 +1373,21 @@
         <w:rPr>
           <w:color w:val="1F2328"/>
         </w:rPr>
-        <w:t>s a permanent, bi-directional communication over a transmission control protocol (TCP) connection. SocketIO was a core component of this setup which allowed the use of multiple readers and writers while viewing a single webpage instance.</w:t>
+        <w:t xml:space="preserve">s a permanent, bi-directional communication over a transmission control protocol (TCP) connection. </w:t>
+      </w:r>
+      <w:proofErr w:type="spellStart"/>
+      <w:r>
+        <w:rPr>
+          <w:color w:val="1F2328"/>
+        </w:rPr>
+        <w:t>SocketIO</w:t>
+      </w:r>
+      <w:proofErr w:type="spellEnd"/>
+      <w:r>
+        <w:rPr>
+          <w:color w:val="1F2328"/>
+        </w:rPr>
+        <w:t xml:space="preserve"> was a core component of this setup which allowed the use of multiple readers and writers while viewing a single webpage instance.</w:t>
       </w:r>
     </w:p>
     <w:p>
@@ -1231,13 +1409,27 @@
         <w:rPr>
           <w:color w:val="1F2328"/>
         </w:rPr>
-        <w:t>To help improve concurrency of threads and allow readers to return values to other functions for output, Thread</w:t>
-      </w:r>
-      <w:r>
-        <w:rPr>
-          <w:color w:val="1F2328"/>
-        </w:rPr>
-        <w:t>PoolExecutor was used to achieve these aims.</w:t>
+        <w:t xml:space="preserve">To help improve concurrency of threads and allow readers to return values to other functions for output, </w:t>
+      </w:r>
+      <w:proofErr w:type="spellStart"/>
+      <w:r>
+        <w:rPr>
+          <w:color w:val="1F2328"/>
+        </w:rPr>
+        <w:t>Thread</w:t>
+      </w:r>
+      <w:r>
+        <w:rPr>
+          <w:color w:val="1F2328"/>
+        </w:rPr>
+        <w:t>PoolExecutor</w:t>
+      </w:r>
+      <w:proofErr w:type="spellEnd"/>
+      <w:r>
+        <w:rPr>
+          <w:color w:val="1F2328"/>
+        </w:rPr>
+        <w:t xml:space="preserve"> was used to achieve these aims.</w:t>
       </w:r>
     </w:p>
     <w:p>
@@ -1261,11 +1453,19 @@
         </w:rPr>
         <w:t xml:space="preserve">For readers threads, if any writer threads are active or waiting, then the new reader thread must wait until all writer threads have left the system. This will also include new writer threads that enter while the reader threads are waiting. Writer threads must wait for all active readers to finish first and there is no other writer thread already executing. Once a thread is finished, they will signal the appropriate thread to start their execution with </w:t>
       </w:r>
-      <w:r>
-        <w:rPr>
-          <w:color w:val="1F2328"/>
-        </w:rPr>
-        <w:t>notify()</w:t>
+      <w:proofErr w:type="gramStart"/>
+      <w:r>
+        <w:rPr>
+          <w:color w:val="1F2328"/>
+        </w:rPr>
+        <w:t>notify(</w:t>
+      </w:r>
+      <w:proofErr w:type="gramEnd"/>
+      <w:r>
+        <w:rPr>
+          <w:color w:val="1F2328"/>
+        </w:rPr>
+        <w:t>)</w:t>
       </w:r>
       <w:r>
         <w:rPr>
@@ -1397,7 +1597,47 @@
           <w:kern w:val="0"/>
           <w14:ligatures w14:val="none"/>
         </w:rPr>
-        <w:t>Primarily worked on the setup of the web server. This included setting up the flask environment using SQLAlchemy to create a database to hold the hotel booking data, setting up communication with SocketIO so that live changes could be made, and setting up all webpages. She set up the booking webpage to create changes to the database and mark the hotels as booked, and the reader page which regularly queries the database for the latest data on all hotel bookings.</w:t>
+        <w:t xml:space="preserve">Primarily worked on the setup of the web server. This included setting up the flask environment using </w:t>
+      </w:r>
+      <w:proofErr w:type="spellStart"/>
+      <w:r>
+        <w:rPr>
+          <w:rFonts w:ascii="Times New Roman" w:eastAsia="Times New Roman" w:hAnsi="Times New Roman" w:cs="Times New Roman"/>
+          <w:color w:val="1F2328"/>
+          <w:kern w:val="0"/>
+          <w14:ligatures w14:val="none"/>
+        </w:rPr>
+        <w:t>SQLAlchemy</w:t>
+      </w:r>
+      <w:proofErr w:type="spellEnd"/>
+      <w:r>
+        <w:rPr>
+          <w:rFonts w:ascii="Times New Roman" w:eastAsia="Times New Roman" w:hAnsi="Times New Roman" w:cs="Times New Roman"/>
+          <w:color w:val="1F2328"/>
+          <w:kern w:val="0"/>
+          <w14:ligatures w14:val="none"/>
+        </w:rPr>
+        <w:t xml:space="preserve"> to create a database to hold the hotel booking data, setting up communication with </w:t>
+      </w:r>
+      <w:proofErr w:type="spellStart"/>
+      <w:r>
+        <w:rPr>
+          <w:rFonts w:ascii="Times New Roman" w:eastAsia="Times New Roman" w:hAnsi="Times New Roman" w:cs="Times New Roman"/>
+          <w:color w:val="1F2328"/>
+          <w:kern w:val="0"/>
+          <w14:ligatures w14:val="none"/>
+        </w:rPr>
+        <w:t>SocketIO</w:t>
+      </w:r>
+      <w:proofErr w:type="spellEnd"/>
+      <w:r>
+        <w:rPr>
+          <w:rFonts w:ascii="Times New Roman" w:eastAsia="Times New Roman" w:hAnsi="Times New Roman" w:cs="Times New Roman"/>
+          <w:color w:val="1F2328"/>
+          <w:kern w:val="0"/>
+          <w14:ligatures w14:val="none"/>
+        </w:rPr>
+        <w:t xml:space="preserve"> so that live changes could be made, and setting up all webpages. She set up the booking webpage to create changes to the database and mark the hotels as booked, and the reader page which regularly queries the database for the latest data on all hotel bookings.</w:t>
       </w:r>
     </w:p>
     <w:p>
@@ -1474,7 +1714,21 @@
         <w:rPr>
           <w:rFonts w:ascii="Times New Roman" w:hAnsi="Times New Roman" w:cs="Times New Roman"/>
         </w:rPr>
-        <w:t xml:space="preserve">When testing the interaction between reader and writer threads, sometimes there would be a deadlock where writers would wait forever and since there was a writer waiting to run, new reader threads also waited. This is due to a natural problem with servers where some requests either fail or stall. So, when a reader thread attempts to but fails to access the database, the system halts. This was fixed with a simple try block around the critical section and a finally block around the exit section to allow failed accesses of the database to still update the number of threads in the system. Another issue was that the python Threading library does not allow threads to return a value to be assigned to another variable. This was important for the reader threads generated by ping since this was needed to properly display the data. ThreadPoolExecutor was used as the solution since it allows </w:t>
+        <w:t xml:space="preserve">When testing the interaction between reader and writer threads, sometimes there would be a deadlock where writers would wait forever and since there was a writer waiting to run, new reader threads also waited. This is due to a natural problem with servers where some requests either fail or stall. So, when a reader thread attempts to but fails to access the database, the system halts. This was fixed with a simple try block around the critical section and a finally block around the exit section to allow failed accesses of the database to still update the number of threads in the system. Another issue was that the python Threading library does not allow threads to return a value to be assigned to another variable. This was important for the reader threads generated by ping since this was needed to properly display the data. </w:t>
+      </w:r>
+      <w:proofErr w:type="spellStart"/>
+      <w:r>
+        <w:rPr>
+          <w:rFonts w:ascii="Times New Roman" w:hAnsi="Times New Roman" w:cs="Times New Roman"/>
+        </w:rPr>
+        <w:t>ThreadPoolExecutor</w:t>
+      </w:r>
+      <w:proofErr w:type="spellEnd"/>
+      <w:r>
+        <w:rPr>
+          <w:rFonts w:ascii="Times New Roman" w:hAnsi="Times New Roman" w:cs="Times New Roman"/>
+        </w:rPr>
+        <w:t xml:space="preserve"> was used as the solution since it allows </w:t>
       </w:r>
       <w:r>
         <w:rPr>
@@ -1541,7 +1795,173 @@
       <w:pPr>
         <w:rPr>
           <w:rFonts w:ascii="Times New Roman" w:hAnsi="Times New Roman" w:cs="Times New Roman"/>
-          <w:color w:val="EE0000"/>
+        </w:rPr>
+      </w:pPr>
+      <w:r>
+        <w:rPr>
+          <w:rFonts w:ascii="Times New Roman" w:hAnsi="Times New Roman" w:cs="Times New Roman"/>
+        </w:rPr>
+        <w:t>The results show the writer priority reader-writer approach was successfully implemented into the web server. The Hotel Monitoring Page visualizes the logic as shown in figure 1. Using the Test Readers and Writers button, when a writer enters the system and a reader is active, the “waiting writer action” is displayed. After the active reader thread finishes, the writer threads execute one at a time</w:t>
+      </w:r>
+      <w:r>
+        <w:rPr>
+          <w:rFonts w:ascii="Times New Roman" w:hAnsi="Times New Roman" w:cs="Times New Roman"/>
+        </w:rPr>
+        <w:t xml:space="preserve"> while displaying their actions. Reader threads then continue to retrieve data once all writers have finished and left the system. Figure 1 also demonstrates that the reader and writer threads act in a random order and is not predetermined.</w:t>
+      </w:r>
+    </w:p>
+    <w:p>
+      <w:pPr>
+        <w:rPr>
+          <w:rFonts w:ascii="Times New Roman" w:hAnsi="Times New Roman" w:cs="Times New Roman"/>
+        </w:rPr>
+      </w:pPr>
+      <w:r>
+        <w:rPr>
+          <w:rFonts w:ascii="Times New Roman" w:hAnsi="Times New Roman" w:cs="Times New Roman"/>
+          <w:noProof/>
+        </w:rPr>
+        <w:drawing>
+          <wp:inline distT="0" distB="0" distL="0" distR="0" wp14:anchorId="73CC37CB" wp14:editId="7A1C44FC">
+            <wp:extent cx="5943600" cy="4901565"/>
+            <wp:effectExtent l="0" t="0" r="0" b="0"/>
+            <wp:docPr id="403784328" name="Picture 2"/>
+            <wp:cNvGraphicFramePr>
+              <a:graphicFrameLocks xmlns:a="http://schemas.openxmlformats.org/drawingml/2006/main" noChangeAspect="1"/>
+            </wp:cNvGraphicFramePr>
+            <a:graphic xmlns:a="http://schemas.openxmlformats.org/drawingml/2006/main">
+              <a:graphicData uri="http://schemas.openxmlformats.org/drawingml/2006/picture">
+                <pic:pic xmlns:pic="http://schemas.openxmlformats.org/drawingml/2006/picture">
+                  <pic:nvPicPr>
+                    <pic:cNvPr id="403784328" name="Picture 403784328"/>
+                    <pic:cNvPicPr/>
+                  </pic:nvPicPr>
+                  <pic:blipFill>
+                    <a:blip r:embed="rId7">
+                      <a:extLst>
+                        <a:ext uri="{28A0092B-C50C-407E-A947-70E740481C1C}">
+                          <a14:useLocalDpi xmlns:a14="http://schemas.microsoft.com/office/drawing/2010/main" val="0"/>
+                        </a:ext>
+                      </a:extLst>
+                    </a:blip>
+                    <a:stretch>
+                      <a:fillRect/>
+                    </a:stretch>
+                  </pic:blipFill>
+                  <pic:spPr>
+                    <a:xfrm>
+                      <a:off x="0" y="0"/>
+                      <a:ext cx="5943600" cy="4901565"/>
+                    </a:xfrm>
+                    <a:prstGeom prst="rect">
+                      <a:avLst/>
+                    </a:prstGeom>
+                  </pic:spPr>
+                </pic:pic>
+              </a:graphicData>
+            </a:graphic>
+          </wp:inline>
+        </w:drawing>
+      </w:r>
+    </w:p>
+    <w:p>
+      <w:pPr>
+        <w:rPr>
+          <w:rFonts w:ascii="Times New Roman" w:hAnsi="Times New Roman" w:cs="Times New Roman"/>
+        </w:rPr>
+      </w:pPr>
+      <w:r>
+        <w:rPr>
+          <w:rFonts w:ascii="Times New Roman" w:hAnsi="Times New Roman" w:cs="Times New Roman"/>
+        </w:rPr>
+        <w:t>Figure 1: Example of the reader-writer logic working in Hotel Monitoring Page.</w:t>
+      </w:r>
+    </w:p>
+    <w:p>
+      <w:pPr>
+        <w:rPr>
+          <w:rFonts w:ascii="Times New Roman" w:hAnsi="Times New Roman" w:cs="Times New Roman"/>
+        </w:rPr>
+      </w:pPr>
+      <w:r>
+        <w:rPr>
+          <w:rFonts w:ascii="Times New Roman" w:hAnsi="Times New Roman" w:cs="Times New Roman"/>
+        </w:rPr>
+        <w:lastRenderedPageBreak/>
+        <w:t>Booking a room in the Booking Hotel page also correctly updates the database which can be viewed in the Hotel Monitoring Page. In both cases of writer threads booking a room, after the entered amount of time another writer thread is created to update the room booking time back to 0.</w:t>
+      </w:r>
+    </w:p>
+    <w:p>
+      <w:pPr>
+        <w:rPr>
+          <w:rFonts w:ascii="Times New Roman" w:hAnsi="Times New Roman" w:cs="Times New Roman"/>
+        </w:rPr>
+      </w:pPr>
+      <w:r>
+        <w:rPr>
+          <w:rFonts w:ascii="Times New Roman" w:hAnsi="Times New Roman" w:cs="Times New Roman"/>
+          <w:noProof/>
+        </w:rPr>
+        <w:drawing>
+          <wp:inline distT="0" distB="0" distL="0" distR="0" wp14:anchorId="03AA48DF" wp14:editId="16022EFE">
+            <wp:extent cx="5943600" cy="3727450"/>
+            <wp:effectExtent l="0" t="0" r="0" b="6350"/>
+            <wp:docPr id="2006263341" name="Picture 3"/>
+            <wp:cNvGraphicFramePr>
+              <a:graphicFrameLocks xmlns:a="http://schemas.openxmlformats.org/drawingml/2006/main" noChangeAspect="1"/>
+            </wp:cNvGraphicFramePr>
+            <a:graphic xmlns:a="http://schemas.openxmlformats.org/drawingml/2006/main">
+              <a:graphicData uri="http://schemas.openxmlformats.org/drawingml/2006/picture">
+                <pic:pic xmlns:pic="http://schemas.openxmlformats.org/drawingml/2006/picture">
+                  <pic:nvPicPr>
+                    <pic:cNvPr id="2006263341" name="Picture 2006263341"/>
+                    <pic:cNvPicPr/>
+                  </pic:nvPicPr>
+                  <pic:blipFill>
+                    <a:blip r:embed="rId8">
+                      <a:extLst>
+                        <a:ext uri="{28A0092B-C50C-407E-A947-70E740481C1C}">
+                          <a14:useLocalDpi xmlns:a14="http://schemas.microsoft.com/office/drawing/2010/main" val="0"/>
+                        </a:ext>
+                      </a:extLst>
+                    </a:blip>
+                    <a:stretch>
+                      <a:fillRect/>
+                    </a:stretch>
+                  </pic:blipFill>
+                  <pic:spPr>
+                    <a:xfrm>
+                      <a:off x="0" y="0"/>
+                      <a:ext cx="5943600" cy="3727450"/>
+                    </a:xfrm>
+                    <a:prstGeom prst="rect">
+                      <a:avLst/>
+                    </a:prstGeom>
+                  </pic:spPr>
+                </pic:pic>
+              </a:graphicData>
+            </a:graphic>
+          </wp:inline>
+        </w:drawing>
+      </w:r>
+    </w:p>
+    <w:p>
+      <w:pPr>
+        <w:rPr>
+          <w:rFonts w:ascii="Times New Roman" w:hAnsi="Times New Roman" w:cs="Times New Roman"/>
+        </w:rPr>
+      </w:pPr>
+      <w:r>
+        <w:rPr>
+          <w:rFonts w:ascii="Times New Roman" w:hAnsi="Times New Roman" w:cs="Times New Roman"/>
+        </w:rPr>
+        <w:t>Figure 2. Writer threads updating values of room’s booking times back to 0.</w:t>
+      </w:r>
+    </w:p>
+    <w:p>
+      <w:pPr>
+        <w:rPr>
+          <w:rFonts w:ascii="Times New Roman" w:hAnsi="Times New Roman" w:cs="Times New Roman"/>
           <w:sz w:val="40"/>
           <w:szCs w:val="40"/>
         </w:rPr>
@@ -1549,27 +1969,9 @@
       <w:r>
         <w:rPr>
           <w:rFonts w:ascii="Times New Roman" w:hAnsi="Times New Roman" w:cs="Times New Roman"/>
-          <w:color w:val="EE0000"/>
           <w:sz w:val="40"/>
           <w:szCs w:val="40"/>
         </w:rPr>
-        <w:t>reminder</w:t>
-      </w:r>
-    </w:p>
-    <w:p>
-      <w:pPr>
-        <w:rPr>
-          <w:rFonts w:ascii="Times New Roman" w:hAnsi="Times New Roman" w:cs="Times New Roman"/>
-          <w:sz w:val="40"/>
-          <w:szCs w:val="40"/>
-        </w:rPr>
-      </w:pPr>
-      <w:r>
-        <w:rPr>
-          <w:rFonts w:ascii="Times New Roman" w:hAnsi="Times New Roman" w:cs="Times New Roman"/>
-          <w:sz w:val="40"/>
-          <w:szCs w:val="40"/>
-        </w:rPr>
         <w:t xml:space="preserve">Future Work: </w:t>
       </w:r>
     </w:p>
@@ -1583,7 +1985,21 @@
         <w:rPr>
           <w:rFonts w:ascii="Times New Roman" w:hAnsi="Times New Roman" w:cs="Times New Roman"/>
         </w:rPr>
-        <w:t>Future work on the project could include implementing other approaches to the reader-writer problem such as reader priority or a balance approach. This could demonstrate the difference visually to help improve understanding of the differences between the approaches. Examples could added to show the how starvation could occur when either reader or writer priority is used.</w:t>
+        <w:t xml:space="preserve">Future work on the project could include implementing other approaches to the reader-writer problem such as reader priority or a balance approach. This could demonstrate the difference visually to help improve understanding of the differences between the approaches. Examples could </w:t>
+      </w:r>
+      <w:proofErr w:type="gramStart"/>
+      <w:r>
+        <w:rPr>
+          <w:rFonts w:ascii="Times New Roman" w:hAnsi="Times New Roman" w:cs="Times New Roman"/>
+        </w:rPr>
+        <w:t>added</w:t>
+      </w:r>
+      <w:proofErr w:type="gramEnd"/>
+      <w:r>
+        <w:rPr>
+          <w:rFonts w:ascii="Times New Roman" w:hAnsi="Times New Roman" w:cs="Times New Roman"/>
+        </w:rPr>
+        <w:t xml:space="preserve"> to show the how starvation could occur when either reader or writer priority is used.</w:t>
       </w:r>
     </w:p>
     <w:p>
@@ -1686,6 +2102,7 @@
               </w:rPr>
               <w:t>B. Akash. 2025. Python Flask - Request Object. </w:t>
             </w:r>
+            <w:proofErr w:type="spellStart"/>
             <w:r>
               <w:rPr>
                 <w:rFonts w:ascii="Times New Roman" w:eastAsia="Times New Roman" w:hAnsi="Times New Roman" w:cs="Times New Roman"/>
@@ -1696,6 +2113,7 @@
               </w:rPr>
               <w:t>GeeksforGeeks</w:t>
             </w:r>
+            <w:proofErr w:type="spellEnd"/>
             <w:r>
               <w:rPr>
                 <w:rFonts w:ascii="Times New Roman" w:eastAsia="Times New Roman" w:hAnsi="Times New Roman" w:cs="Times New Roman"/>
@@ -1728,6 +2146,7 @@
                 <w:kern w:val="0"/>
                 <w14:ligatures w14:val="none"/>
               </w:rPr>
+              <w:lastRenderedPageBreak/>
               <w:t>[2]</w:t>
             </w:r>
           </w:p>
@@ -1752,7 +2171,25 @@
                 <w:kern w:val="0"/>
                 <w14:ligatures w14:val="none"/>
               </w:rPr>
-              <w:t>Michael Bayer et Al. 2026. SQLAlchemy 2.0 Documentation. </w:t>
+              <w:t xml:space="preserve">Michael Bayer et Al. 2026. </w:t>
+            </w:r>
+            <w:proofErr w:type="spellStart"/>
+            <w:r>
+              <w:rPr>
+                <w:rFonts w:ascii="Times New Roman" w:eastAsia="Times New Roman" w:hAnsi="Times New Roman" w:cs="Times New Roman"/>
+                <w:kern w:val="0"/>
+                <w14:ligatures w14:val="none"/>
+              </w:rPr>
+              <w:t>SQLAlchemy</w:t>
+            </w:r>
+            <w:proofErr w:type="spellEnd"/>
+            <w:r>
+              <w:rPr>
+                <w:rFonts w:ascii="Times New Roman" w:eastAsia="Times New Roman" w:hAnsi="Times New Roman" w:cs="Times New Roman"/>
+                <w:kern w:val="0"/>
+                <w14:ligatures w14:val="none"/>
+              </w:rPr>
+              <w:t xml:space="preserve"> 2.0 Documentation. </w:t>
             </w:r>
             <w:r>
               <w:rPr>
@@ -1820,7 +2257,43 @@
                 <w:kern w:val="0"/>
                 <w14:ligatures w14:val="none"/>
               </w:rPr>
-              <w:t>Miguel Grinberg. 2014. Easy WebSockets with Flask and Gevent. </w:t>
+              <w:t xml:space="preserve">Miguel Grinberg. 2014. Easy </w:t>
+            </w:r>
+            <w:proofErr w:type="spellStart"/>
+            <w:r>
+              <w:rPr>
+                <w:rFonts w:ascii="Times New Roman" w:eastAsia="Times New Roman" w:hAnsi="Times New Roman" w:cs="Times New Roman"/>
+                <w:kern w:val="0"/>
+                <w14:ligatures w14:val="none"/>
+              </w:rPr>
+              <w:t>WebSockets</w:t>
+            </w:r>
+            <w:proofErr w:type="spellEnd"/>
+            <w:r>
+              <w:rPr>
+                <w:rFonts w:ascii="Times New Roman" w:eastAsia="Times New Roman" w:hAnsi="Times New Roman" w:cs="Times New Roman"/>
+                <w:kern w:val="0"/>
+                <w14:ligatures w14:val="none"/>
+              </w:rPr>
+              <w:t xml:space="preserve"> with Flask and </w:t>
+            </w:r>
+            <w:proofErr w:type="spellStart"/>
+            <w:r>
+              <w:rPr>
+                <w:rFonts w:ascii="Times New Roman" w:eastAsia="Times New Roman" w:hAnsi="Times New Roman" w:cs="Times New Roman"/>
+                <w:kern w:val="0"/>
+                <w14:ligatures w14:val="none"/>
+              </w:rPr>
+              <w:t>Gevent</w:t>
+            </w:r>
+            <w:proofErr w:type="spellEnd"/>
+            <w:r>
+              <w:rPr>
+                <w:rFonts w:ascii="Times New Roman" w:eastAsia="Times New Roman" w:hAnsi="Times New Roman" w:cs="Times New Roman"/>
+                <w:kern w:val="0"/>
+                <w14:ligatures w14:val="none"/>
+              </w:rPr>
+              <w:t>. </w:t>
             </w:r>
             <w:r>
               <w:rPr>
@@ -1898,8 +2371,20 @@
                 <w:kern w:val="0"/>
                 <w14:ligatures w14:val="none"/>
               </w:rPr>
-              <w:t>Flask-Societio.ReadtheDocs</w:t>
-            </w:r>
+              <w:t>Flask-</w:t>
+            </w:r>
+            <w:proofErr w:type="spellStart"/>
+            <w:r>
+              <w:rPr>
+                <w:rFonts w:ascii="Times New Roman" w:eastAsia="Times New Roman" w:hAnsi="Times New Roman" w:cs="Times New Roman"/>
+                <w:i/>
+                <w:iCs/>
+                <w:kern w:val="0"/>
+                <w14:ligatures w14:val="none"/>
+              </w:rPr>
+              <w:t>Societio.ReadtheDocs</w:t>
+            </w:r>
+            <w:proofErr w:type="spellEnd"/>
             <w:r>
               <w:rPr>
                 <w:rFonts w:ascii="Times New Roman" w:eastAsia="Times New Roman" w:hAnsi="Times New Roman" w:cs="Times New Roman"/>
@@ -1958,6 +2443,7 @@
               </w:rPr>
               <w:t>Khushi Gupta. 2025. Convert Python List to JSON. </w:t>
             </w:r>
+            <w:proofErr w:type="spellStart"/>
             <w:r>
               <w:rPr>
                 <w:rFonts w:ascii="Times New Roman" w:eastAsia="Times New Roman" w:hAnsi="Times New Roman" w:cs="Times New Roman"/>
@@ -1968,6 +2454,7 @@
               </w:rPr>
               <w:t>GeeksforGeeks</w:t>
             </w:r>
+            <w:proofErr w:type="spellEnd"/>
             <w:r>
               <w:rPr>
                 <w:rFonts w:ascii="Times New Roman" w:eastAsia="Times New Roman" w:hAnsi="Times New Roman" w:cs="Times New Roman"/>
@@ -2024,8 +2511,27 @@
                 <w:kern w:val="0"/>
                 <w14:ligatures w14:val="none"/>
               </w:rPr>
-              <w:t>Lito Nicolai. 2021. The basics of role-based access control in SQLAlchemy. </w:t>
-            </w:r>
+              <w:t xml:space="preserve">Lito Nicolai. 2021. The basics of role-based access control in </w:t>
+            </w:r>
+            <w:proofErr w:type="spellStart"/>
+            <w:r>
+              <w:rPr>
+                <w:rFonts w:ascii="Times New Roman" w:eastAsia="Times New Roman" w:hAnsi="Times New Roman" w:cs="Times New Roman"/>
+                <w:kern w:val="0"/>
+                <w14:ligatures w14:val="none"/>
+              </w:rPr>
+              <w:t>SQLAlchemy</w:t>
+            </w:r>
+            <w:proofErr w:type="spellEnd"/>
+            <w:r>
+              <w:rPr>
+                <w:rFonts w:ascii="Times New Roman" w:eastAsia="Times New Roman" w:hAnsi="Times New Roman" w:cs="Times New Roman"/>
+                <w:kern w:val="0"/>
+                <w14:ligatures w14:val="none"/>
+              </w:rPr>
+              <w:t>. </w:t>
+            </w:r>
+            <w:proofErr w:type="spellStart"/>
             <w:r>
               <w:rPr>
                 <w:rFonts w:ascii="Times New Roman" w:eastAsia="Times New Roman" w:hAnsi="Times New Roman" w:cs="Times New Roman"/>
@@ -2036,6 +2542,7 @@
               </w:rPr>
               <w:t>OsoHQ</w:t>
             </w:r>
+            <w:proofErr w:type="spellEnd"/>
             <w:r>
               <w:rPr>
                 <w:rFonts w:ascii="Times New Roman" w:eastAsia="Times New Roman" w:hAnsi="Times New Roman" w:cs="Times New Roman"/>
@@ -2092,8 +2599,27 @@
                 <w:kern w:val="0"/>
                 <w14:ligatures w14:val="none"/>
               </w:rPr>
-              <w:t>Amit Pathak. 2023. Querying and selecting specific column in SQLAlchemy. </w:t>
-            </w:r>
+              <w:t xml:space="preserve">Amit Pathak. 2023. Querying and selecting specific column in </w:t>
+            </w:r>
+            <w:proofErr w:type="spellStart"/>
+            <w:r>
+              <w:rPr>
+                <w:rFonts w:ascii="Times New Roman" w:eastAsia="Times New Roman" w:hAnsi="Times New Roman" w:cs="Times New Roman"/>
+                <w:kern w:val="0"/>
+                <w14:ligatures w14:val="none"/>
+              </w:rPr>
+              <w:t>SQLAlchemy</w:t>
+            </w:r>
+            <w:proofErr w:type="spellEnd"/>
+            <w:r>
+              <w:rPr>
+                <w:rFonts w:ascii="Times New Roman" w:eastAsia="Times New Roman" w:hAnsi="Times New Roman" w:cs="Times New Roman"/>
+                <w:kern w:val="0"/>
+                <w14:ligatures w14:val="none"/>
+              </w:rPr>
+              <w:t>. </w:t>
+            </w:r>
+            <w:proofErr w:type="spellStart"/>
             <w:r>
               <w:rPr>
                 <w:rFonts w:ascii="Times New Roman" w:eastAsia="Times New Roman" w:hAnsi="Times New Roman" w:cs="Times New Roman"/>
@@ -2104,6 +2630,7 @@
               </w:rPr>
               <w:t>GeeksforGeeks</w:t>
             </w:r>
+            <w:proofErr w:type="spellEnd"/>
             <w:r>
               <w:rPr>
                 <w:rFonts w:ascii="Times New Roman" w:eastAsia="Times New Roman" w:hAnsi="Times New Roman" w:cs="Times New Roman"/>
@@ -2160,8 +2687,27 @@
                 <w:kern w:val="0"/>
                 <w14:ligatures w14:val="none"/>
               </w:rPr>
-              <w:t>Amit Pathak. 2024. SQLAlchemy Core - Creating Table. </w:t>
-            </w:r>
+              <w:t xml:space="preserve">Amit Pathak. 2024. </w:t>
+            </w:r>
+            <w:proofErr w:type="spellStart"/>
+            <w:r>
+              <w:rPr>
+                <w:rFonts w:ascii="Times New Roman" w:eastAsia="Times New Roman" w:hAnsi="Times New Roman" w:cs="Times New Roman"/>
+                <w:kern w:val="0"/>
+                <w14:ligatures w14:val="none"/>
+              </w:rPr>
+              <w:t>SQLAlchemy</w:t>
+            </w:r>
+            <w:proofErr w:type="spellEnd"/>
+            <w:r>
+              <w:rPr>
+                <w:rFonts w:ascii="Times New Roman" w:eastAsia="Times New Roman" w:hAnsi="Times New Roman" w:cs="Times New Roman"/>
+                <w:kern w:val="0"/>
+                <w14:ligatures w14:val="none"/>
+              </w:rPr>
+              <w:t xml:space="preserve"> Core - Creating Table. </w:t>
+            </w:r>
+            <w:proofErr w:type="spellStart"/>
             <w:r>
               <w:rPr>
                 <w:rFonts w:ascii="Times New Roman" w:eastAsia="Times New Roman" w:hAnsi="Times New Roman" w:cs="Times New Roman"/>
@@ -2172,6 +2718,7 @@
               </w:rPr>
               <w:t>GeeksforGeeks</w:t>
             </w:r>
+            <w:proofErr w:type="spellEnd"/>
             <w:r>
               <w:rPr>
                 <w:rFonts w:ascii="Times New Roman" w:eastAsia="Times New Roman" w:hAnsi="Times New Roman" w:cs="Times New Roman"/>
@@ -2204,7 +2751,6 @@
                 <w:kern w:val="0"/>
                 <w14:ligatures w14:val="none"/>
               </w:rPr>
-              <w:lastRenderedPageBreak/>
               <w:t>[9]</w:t>
             </w:r>
           </w:p>
@@ -2231,6 +2777,7 @@
               </w:rPr>
               <w:t>Kushwanth Reddy. 2025. Retrieving HTML Form data using Flask. </w:t>
             </w:r>
+            <w:proofErr w:type="spellStart"/>
             <w:r>
               <w:rPr>
                 <w:rFonts w:ascii="Times New Roman" w:eastAsia="Times New Roman" w:hAnsi="Times New Roman" w:cs="Times New Roman"/>
@@ -2241,6 +2788,7 @@
               </w:rPr>
               <w:t>GeeksforGeeks</w:t>
             </w:r>
+            <w:proofErr w:type="spellEnd"/>
             <w:r>
               <w:rPr>
                 <w:rFonts w:ascii="Times New Roman" w:eastAsia="Times New Roman" w:hAnsi="Times New Roman" w:cs="Times New Roman"/>
@@ -2299,6 +2847,7 @@
               </w:rPr>
               <w:t>Kartikeya Shukla. 2026. Introduction to Web development using Flask. </w:t>
             </w:r>
+            <w:proofErr w:type="spellStart"/>
             <w:r>
               <w:rPr>
                 <w:rFonts w:ascii="Times New Roman" w:eastAsia="Times New Roman" w:hAnsi="Times New Roman" w:cs="Times New Roman"/>
@@ -2309,6 +2858,7 @@
               </w:rPr>
               <w:t>GeeksforGeeks</w:t>
             </w:r>
+            <w:proofErr w:type="spellEnd"/>
             <w:r>
               <w:rPr>
                 <w:rFonts w:ascii="Times New Roman" w:eastAsia="Times New Roman" w:hAnsi="Times New Roman" w:cs="Times New Roman"/>
@@ -2367,6 +2917,7 @@
               </w:rPr>
               <w:t>Sachidanand Thakur. 2025. Creating Instance Objects in Python. </w:t>
             </w:r>
+            <w:proofErr w:type="spellStart"/>
             <w:r>
               <w:rPr>
                 <w:rFonts w:ascii="Times New Roman" w:eastAsia="Times New Roman" w:hAnsi="Times New Roman" w:cs="Times New Roman"/>
@@ -2377,6 +2928,7 @@
               </w:rPr>
               <w:t>GeeksforGeeks</w:t>
             </w:r>
+            <w:proofErr w:type="spellEnd"/>
             <w:r>
               <w:rPr>
                 <w:rFonts w:ascii="Times New Roman" w:eastAsia="Times New Roman" w:hAnsi="Times New Roman" w:cs="Times New Roman"/>
@@ -2495,14 +3047,25 @@
                 <w14:ligatures w14:val="none"/>
               </w:rPr>
             </w:pPr>
-            <w:r>
-              <w:rPr>
-                <w:rFonts w:ascii="Times New Roman" w:eastAsia="Times New Roman" w:hAnsi="Times New Roman" w:cs="Times New Roman"/>
-                <w:kern w:val="0"/>
-                <w14:ligatures w14:val="none"/>
-              </w:rPr>
-              <w:t>TutorialsPoint Team. SQLite - Commands. </w:t>
-            </w:r>
+            <w:proofErr w:type="spellStart"/>
+            <w:r>
+              <w:rPr>
+                <w:rFonts w:ascii="Times New Roman" w:eastAsia="Times New Roman" w:hAnsi="Times New Roman" w:cs="Times New Roman"/>
+                <w:kern w:val="0"/>
+                <w14:ligatures w14:val="none"/>
+              </w:rPr>
+              <w:t>TutorialsPoint</w:t>
+            </w:r>
+            <w:proofErr w:type="spellEnd"/>
+            <w:r>
+              <w:rPr>
+                <w:rFonts w:ascii="Times New Roman" w:eastAsia="Times New Roman" w:hAnsi="Times New Roman" w:cs="Times New Roman"/>
+                <w:kern w:val="0"/>
+                <w14:ligatures w14:val="none"/>
+              </w:rPr>
+              <w:t xml:space="preserve"> Team. SQLite - Commands. </w:t>
+            </w:r>
+            <w:proofErr w:type="spellStart"/>
             <w:r>
               <w:rPr>
                 <w:rFonts w:ascii="Times New Roman" w:eastAsia="Times New Roman" w:hAnsi="Times New Roman" w:cs="Times New Roman"/>
@@ -2513,6 +3076,7 @@
               </w:rPr>
               <w:t>tutorialspoint</w:t>
             </w:r>
+            <w:proofErr w:type="spellEnd"/>
             <w:r>
               <w:rPr>
                 <w:rFonts w:ascii="Times New Roman" w:eastAsia="Times New Roman" w:hAnsi="Times New Roman" w:cs="Times New Roman"/>
@@ -2571,6 +3135,7 @@
               </w:rPr>
               <w:t>Anish Singh Walia. 2020. How To Build a Web Application Using Flask in Python 3. </w:t>
             </w:r>
+            <w:proofErr w:type="spellStart"/>
             <w:r>
               <w:rPr>
                 <w:rFonts w:ascii="Times New Roman" w:eastAsia="Times New Roman" w:hAnsi="Times New Roman" w:cs="Times New Roman"/>
@@ -2581,6 +3146,7 @@
               </w:rPr>
               <w:t>DigitalOcean</w:t>
             </w:r>
+            <w:proofErr w:type="spellEnd"/>
             <w:r>
               <w:rPr>
                 <w:rFonts w:ascii="Times New Roman" w:eastAsia="Times New Roman" w:hAnsi="Times New Roman" w:cs="Times New Roman"/>
@@ -2639,6 +3205,7 @@
               </w:rPr>
               <w:t>Muhammad Waseem. 2024. Flask and Flask-Login: A Guide to Building Secure Web Applications. </w:t>
             </w:r>
+            <w:proofErr w:type="spellStart"/>
             <w:r>
               <w:rPr>
                 <w:rFonts w:ascii="Times New Roman" w:eastAsia="Times New Roman" w:hAnsi="Times New Roman" w:cs="Times New Roman"/>
@@ -2647,7 +3214,18 @@
                 <w:kern w:val="0"/>
                 <w14:ligatures w14:val="none"/>
               </w:rPr>
-              <w:t>Intersystems Developer Community</w:t>
+              <w:t>Intersystems</w:t>
+            </w:r>
+            <w:proofErr w:type="spellEnd"/>
+            <w:r>
+              <w:rPr>
+                <w:rFonts w:ascii="Times New Roman" w:eastAsia="Times New Roman" w:hAnsi="Times New Roman" w:cs="Times New Roman"/>
+                <w:i/>
+                <w:iCs/>
+                <w:kern w:val="0"/>
+                <w14:ligatures w14:val="none"/>
+              </w:rPr>
+              <w:t xml:space="preserve"> Developer Community</w:t>
             </w:r>
             <w:r>
               <w:rPr>
@@ -2683,7 +3261,21 @@
         <w:rPr>
           <w:rFonts w:ascii="Times New Roman" w:hAnsi="Times New Roman" w:cs="Times New Roman"/>
         </w:rPr>
-        <w:t xml:space="preserve">] “Concurrent.futures - launching parallel tasks,” Python documentation, https://docs.python.org/3/library/concurrent.futures.html (accessed May 12, 2026).  </w:t>
+        <w:t>] “</w:t>
+      </w:r>
+      <w:proofErr w:type="spellStart"/>
+      <w:r>
+        <w:rPr>
+          <w:rFonts w:ascii="Times New Roman" w:hAnsi="Times New Roman" w:cs="Times New Roman"/>
+        </w:rPr>
+        <w:t>Concurrent.futures</w:t>
+      </w:r>
+      <w:proofErr w:type="spellEnd"/>
+      <w:r>
+        <w:rPr>
+          <w:rFonts w:ascii="Times New Roman" w:hAnsi="Times New Roman" w:cs="Times New Roman"/>
+        </w:rPr>
+        <w:t xml:space="preserve"> - launching parallel tasks,” Python documentation, https://docs.python.org/3/library/concurrent.futures.html (accessed May 12, 2026).  </w:t>
       </w:r>
     </w:p>
     <w:p>
@@ -2714,8 +3306,8 @@
       </w:pPr>
     </w:p>
     <w:sectPr>
-      <w:footerReference w:type="even" r:id="rId7"/>
-      <w:footerReference w:type="default" r:id="rId8"/>
+      <w:footerReference w:type="even" r:id="rId9"/>
+      <w:footerReference w:type="default" r:id="rId10"/>
       <w:pgSz w:w="12240" w:h="15840"/>
       <w:pgMar w:top="1440" w:right="1440" w:bottom="1440" w:left="1440" w:header="720" w:footer="720" w:gutter="0"/>
       <w:cols w:space="720"/>

</xml_diff>

<commit_message>
added back in reminder
</commit_message>
<xml_diff>
--- a/Python_Server/flask_blog/static/Report/FinalReport.docx
+++ b/Python_Server/flask_blog/static/Report/FinalReport.docx
@@ -634,20 +634,8 @@
           <w14:ligatures w14:val="none"/>
         </w:rPr>
         <w:lastRenderedPageBreak/>
-        <w:t xml:space="preserve">pip install </w:t>
-      </w:r>
-      <w:proofErr w:type="spellStart"/>
-      <w:r>
-        <w:rPr>
-          <w:rFonts w:ascii="Times New Roman" w:eastAsia="Times New Roman" w:hAnsi="Times New Roman" w:cs="Times New Roman"/>
-          <w:color w:val="1F2328"/>
-          <w:kern w:val="0"/>
-          <w:bdr w:val="none" w:sz="0" w:space="0" w:color="auto" w:frame="1"/>
-          <w14:ligatures w14:val="none"/>
-        </w:rPr>
-        <w:t>flask_sqlalchemy</w:t>
-      </w:r>
-      <w:proofErr w:type="spellEnd"/>
+        <w:t>pip install flask_sqlalchemy</w:t>
+      </w:r>
     </w:p>
     <w:p>
       <w:pPr>
@@ -687,20 +675,8 @@
           <w:bdr w:val="none" w:sz="0" w:space="0" w:color="auto" w:frame="1"/>
           <w14:ligatures w14:val="none"/>
         </w:rPr>
-        <w:t xml:space="preserve">pip install </w:t>
-      </w:r>
-      <w:proofErr w:type="spellStart"/>
-      <w:r>
-        <w:rPr>
-          <w:rFonts w:ascii="Times New Roman" w:eastAsia="Times New Roman" w:hAnsi="Times New Roman" w:cs="Times New Roman"/>
-          <w:color w:val="1F2328"/>
-          <w:kern w:val="0"/>
-          <w:bdr w:val="none" w:sz="0" w:space="0" w:color="auto" w:frame="1"/>
-          <w14:ligatures w14:val="none"/>
-        </w:rPr>
-        <w:t>flask_security</w:t>
-      </w:r>
-      <w:proofErr w:type="spellEnd"/>
+        <w:t>pip install flask_security</w:t>
+      </w:r>
     </w:p>
     <w:p>
       <w:pPr>
@@ -740,20 +716,8 @@
           <w:bdr w:val="none" w:sz="0" w:space="0" w:color="auto" w:frame="1"/>
           <w14:ligatures w14:val="none"/>
         </w:rPr>
-        <w:t xml:space="preserve">pip install </w:t>
-      </w:r>
-      <w:proofErr w:type="spellStart"/>
-      <w:r>
-        <w:rPr>
-          <w:rFonts w:ascii="Times New Roman" w:eastAsia="Times New Roman" w:hAnsi="Times New Roman" w:cs="Times New Roman"/>
-          <w:color w:val="1F2328"/>
-          <w:kern w:val="0"/>
-          <w:bdr w:val="none" w:sz="0" w:space="0" w:color="auto" w:frame="1"/>
-          <w14:ligatures w14:val="none"/>
-        </w:rPr>
-        <w:t>flask_socketio</w:t>
-      </w:r>
-      <w:proofErr w:type="spellEnd"/>
+        <w:t>pip install flask_socketio</w:t>
+      </w:r>
     </w:p>
     <w:p>
       <w:pPr>
@@ -826,27 +790,7 @@
           <w:kern w:val="0"/>
           <w14:ligatures w14:val="none"/>
         </w:rPr>
-        <w:t xml:space="preserve">Finally, navigate to the </w:t>
-      </w:r>
-      <w:proofErr w:type="spellStart"/>
-      <w:r>
-        <w:rPr>
-          <w:rFonts w:ascii="Times New Roman" w:eastAsia="Times New Roman" w:hAnsi="Times New Roman" w:cs="Times New Roman"/>
-          <w:color w:val="1F2328"/>
-          <w:kern w:val="0"/>
-          <w14:ligatures w14:val="none"/>
-        </w:rPr>
-        <w:t>flask_blog</w:t>
-      </w:r>
-      <w:proofErr w:type="spellEnd"/>
-      <w:r>
-        <w:rPr>
-          <w:rFonts w:ascii="Times New Roman" w:eastAsia="Times New Roman" w:hAnsi="Times New Roman" w:cs="Times New Roman"/>
-          <w:color w:val="1F2328"/>
-          <w:kern w:val="0"/>
-          <w14:ligatures w14:val="none"/>
-        </w:rPr>
-        <w:t>/ directory and run the following command:</w:t>
+        <w:t>Finally, navigate to the flask_blog/ directory and run the following command:</w:t>
       </w:r>
     </w:p>
     <w:p>
@@ -925,7 +869,6 @@
           <w:bdr w:val="none" w:sz="0" w:space="0" w:color="auto" w:frame="1"/>
         </w:rPr>
       </w:pPr>
-      <w:proofErr w:type="spellStart"/>
       <w:proofErr w:type="gramStart"/>
       <w:r>
         <w:rPr>
@@ -948,10 +891,13 @@
           <w:szCs w:val="24"/>
           <w:bdr w:val="none" w:sz="0" w:space="0" w:color="auto" w:frame="1"/>
         </w:rPr>
-        <w:t>:WARNING</w:t>
-      </w:r>
-      <w:proofErr w:type="spellEnd"/>
-      <w:r>
+        <w:t>:WARNING: This is a development server. Do not use it in a production deployment. Use a production WSGI server instead.</w:t>
+      </w:r>
+    </w:p>
+    <w:p>
+      <w:pPr>
+        <w:pStyle w:val="HTMLPreformatted"/>
+        <w:shd w:val="clear" w:color="auto" w:fill="F6F8FA"/>
         <w:rPr>
           <w:rStyle w:val="HTMLCode"/>
           <w:rFonts w:ascii="Times New Roman" w:hAnsi="Times New Roman" w:cs="Times New Roman"/>
@@ -960,13 +906,8 @@
           <w:szCs w:val="24"/>
           <w:bdr w:val="none" w:sz="0" w:space="0" w:color="auto" w:frame="1"/>
         </w:rPr>
-        <w:t>: This is a development server. Do not use it in a production deployment. Use a production WSGI server instead.</w:t>
-      </w:r>
-    </w:p>
-    <w:p>
-      <w:pPr>
-        <w:pStyle w:val="HTMLPreformatted"/>
-        <w:shd w:val="clear" w:color="auto" w:fill="F6F8FA"/>
+      </w:pPr>
+      <w:r>
         <w:rPr>
           <w:rStyle w:val="HTMLCode"/>
           <w:rFonts w:ascii="Times New Roman" w:hAnsi="Times New Roman" w:cs="Times New Roman"/>
@@ -975,8 +916,13 @@
           <w:szCs w:val="24"/>
           <w:bdr w:val="none" w:sz="0" w:space="0" w:color="auto" w:frame="1"/>
         </w:rPr>
-      </w:pPr>
-      <w:r>
+        <w:t xml:space="preserve"> * Running on http://127.0.0.1:8080</w:t>
+      </w:r>
+    </w:p>
+    <w:p>
+      <w:pPr>
+        <w:pStyle w:val="HTMLPreformatted"/>
+        <w:shd w:val="clear" w:color="auto" w:fill="F6F8FA"/>
         <w:rPr>
           <w:rStyle w:val="HTMLCode"/>
           <w:rFonts w:ascii="Times New Roman" w:hAnsi="Times New Roman" w:cs="Times New Roman"/>
@@ -985,13 +931,9 @@
           <w:szCs w:val="24"/>
           <w:bdr w:val="none" w:sz="0" w:space="0" w:color="auto" w:frame="1"/>
         </w:rPr>
-        <w:t xml:space="preserve"> * Running on http://127.0.0.1:8080</w:t>
-      </w:r>
-    </w:p>
-    <w:p>
-      <w:pPr>
-        <w:pStyle w:val="HTMLPreformatted"/>
-        <w:shd w:val="clear" w:color="auto" w:fill="F6F8FA"/>
+      </w:pPr>
+      <w:proofErr w:type="gramStart"/>
+      <w:r>
         <w:rPr>
           <w:rStyle w:val="HTMLCode"/>
           <w:rFonts w:ascii="Times New Roman" w:hAnsi="Times New Roman" w:cs="Times New Roman"/>
@@ -1000,9 +942,9 @@
           <w:szCs w:val="24"/>
           <w:bdr w:val="none" w:sz="0" w:space="0" w:color="auto" w:frame="1"/>
         </w:rPr>
-      </w:pPr>
-      <w:proofErr w:type="spellStart"/>
-      <w:proofErr w:type="gramStart"/>
+        <w:t>INFO:werkzeug</w:t>
+      </w:r>
+      <w:proofErr w:type="gramEnd"/>
       <w:r>
         <w:rPr>
           <w:rStyle w:val="HTMLCode"/>
@@ -1012,31 +954,7 @@
           <w:szCs w:val="24"/>
           <w:bdr w:val="none" w:sz="0" w:space="0" w:color="auto" w:frame="1"/>
         </w:rPr>
-        <w:t>INFO:werkzeug</w:t>
-      </w:r>
-      <w:proofErr w:type="gramEnd"/>
-      <w:r>
-        <w:rPr>
-          <w:rStyle w:val="HTMLCode"/>
-          <w:rFonts w:ascii="Times New Roman" w:hAnsi="Times New Roman" w:cs="Times New Roman"/>
-          <w:color w:val="1F2328"/>
-          <w:sz w:val="24"/>
-          <w:szCs w:val="24"/>
-          <w:bdr w:val="none" w:sz="0" w:space="0" w:color="auto" w:frame="1"/>
-        </w:rPr>
-        <w:t>:Press</w:t>
-      </w:r>
-      <w:proofErr w:type="spellEnd"/>
-      <w:r>
-        <w:rPr>
-          <w:rStyle w:val="HTMLCode"/>
-          <w:rFonts w:ascii="Times New Roman" w:hAnsi="Times New Roman" w:cs="Times New Roman"/>
-          <w:color w:val="1F2328"/>
-          <w:sz w:val="24"/>
-          <w:szCs w:val="24"/>
-          <w:bdr w:val="none" w:sz="0" w:space="0" w:color="auto" w:frame="1"/>
-        </w:rPr>
-        <w:t xml:space="preserve"> CTRL+C to quit</w:t>
+        <w:t>:Press CTRL+C to quit</w:t>
       </w:r>
     </w:p>
     <w:p>
@@ -1132,21 +1050,7 @@
         <w:rPr>
           <w:rFonts w:ascii="Times New Roman" w:hAnsi="Times New Roman" w:cs="Times New Roman"/>
         </w:rPr>
-        <w:t xml:space="preserve"> password: </w:t>
-      </w:r>
-      <w:proofErr w:type="spellStart"/>
-      <w:r>
-        <w:rPr>
-          <w:rFonts w:ascii="Times New Roman" w:hAnsi="Times New Roman" w:cs="Times New Roman"/>
-        </w:rPr>
-        <w:t>ilovehotels</w:t>
-      </w:r>
-      <w:proofErr w:type="spellEnd"/>
-      <w:r>
-        <w:rPr>
-          <w:rFonts w:ascii="Times New Roman" w:hAnsi="Times New Roman" w:cs="Times New Roman"/>
-        </w:rPr>
-        <w:t xml:space="preserve">). The hotel monitoring page simulates a reader, which is why permissions are not needed. Please note that patience of several seconds is required when loading pages or submitting any input into the server. </w:t>
+        <w:t xml:space="preserve"> password: ilovehotels). The hotel monitoring page simulates a reader, which is why permissions are not needed. Please note that patience of several seconds is required when loading pages or submitting any input into the server. </w:t>
       </w:r>
     </w:p>
     <w:p>
@@ -1333,35 +1237,7 @@
         <w:rPr>
           <w:color w:val="1F2328"/>
         </w:rPr>
-        <w:t xml:space="preserve">The general framework uses Python and the Web Server Gateway Interface (WSGI) web application framework known as Flask. The database setup used </w:t>
-      </w:r>
-      <w:proofErr w:type="spellStart"/>
-      <w:r>
-        <w:rPr>
-          <w:color w:val="1F2328"/>
-        </w:rPr>
-        <w:t>SQLAlchemy</w:t>
-      </w:r>
-      <w:proofErr w:type="spellEnd"/>
-      <w:r>
-        <w:rPr>
-          <w:color w:val="1F2328"/>
-        </w:rPr>
-        <w:t xml:space="preserve">, an Object Relational Mapper (ORM) for using SQL databases with Python. For live views and changes to the database, Flasks own module </w:t>
-      </w:r>
-      <w:proofErr w:type="spellStart"/>
-      <w:r>
-        <w:rPr>
-          <w:color w:val="1F2328"/>
-        </w:rPr>
-        <w:t>SocketIO</w:t>
-      </w:r>
-      <w:proofErr w:type="spellEnd"/>
-      <w:r>
-        <w:rPr>
-          <w:color w:val="1F2328"/>
-        </w:rPr>
-        <w:t xml:space="preserve"> was used, which creat</w:t>
+        <w:t>The general framework uses Python and the Web Server Gateway Interface (WSGI) web application framework known as Flask. The database setup used SQLAlchemy, an Object Relational Mapper (ORM) for using SQL databases with Python. For live views and changes to the database, Flasks own module SocketIO was used, which creat</w:t>
       </w:r>
       <w:r>
         <w:rPr>
@@ -1373,21 +1249,7 @@
         <w:rPr>
           <w:color w:val="1F2328"/>
         </w:rPr>
-        <w:t xml:space="preserve">s a permanent, bi-directional communication over a transmission control protocol (TCP) connection. </w:t>
-      </w:r>
-      <w:proofErr w:type="spellStart"/>
-      <w:r>
-        <w:rPr>
-          <w:color w:val="1F2328"/>
-        </w:rPr>
-        <w:t>SocketIO</w:t>
-      </w:r>
-      <w:proofErr w:type="spellEnd"/>
-      <w:r>
-        <w:rPr>
-          <w:color w:val="1F2328"/>
-        </w:rPr>
-        <w:t xml:space="preserve"> was a core component of this setup which allowed the use of multiple readers and writers while viewing a single webpage instance.</w:t>
+        <w:t>s a permanent, bi-directional communication over a transmission control protocol (TCP) connection. SocketIO was a core component of this setup which allowed the use of multiple readers and writers while viewing a single webpage instance.</w:t>
       </w:r>
     </w:p>
     <w:p>
@@ -1409,27 +1271,13 @@
         <w:rPr>
           <w:color w:val="1F2328"/>
         </w:rPr>
-        <w:t xml:space="preserve">To help improve concurrency of threads and allow readers to return values to other functions for output, </w:t>
-      </w:r>
-      <w:proofErr w:type="spellStart"/>
-      <w:r>
-        <w:rPr>
-          <w:color w:val="1F2328"/>
-        </w:rPr>
-        <w:t>Thread</w:t>
-      </w:r>
-      <w:r>
-        <w:rPr>
-          <w:color w:val="1F2328"/>
-        </w:rPr>
-        <w:t>PoolExecutor</w:t>
-      </w:r>
-      <w:proofErr w:type="spellEnd"/>
-      <w:r>
-        <w:rPr>
-          <w:color w:val="1F2328"/>
-        </w:rPr>
-        <w:t xml:space="preserve"> was used to achieve these aims.</w:t>
+        <w:t>To help improve concurrency of threads and allow readers to return values to other functions for output, Thread</w:t>
+      </w:r>
+      <w:r>
+        <w:rPr>
+          <w:color w:val="1F2328"/>
+        </w:rPr>
+        <w:t>PoolExecutor was used to achieve these aims.</w:t>
       </w:r>
     </w:p>
     <w:p>
@@ -1597,47 +1445,7 @@
           <w:kern w:val="0"/>
           <w14:ligatures w14:val="none"/>
         </w:rPr>
-        <w:t xml:space="preserve">Primarily worked on the setup of the web server. This included setting up the flask environment using </w:t>
-      </w:r>
-      <w:proofErr w:type="spellStart"/>
-      <w:r>
-        <w:rPr>
-          <w:rFonts w:ascii="Times New Roman" w:eastAsia="Times New Roman" w:hAnsi="Times New Roman" w:cs="Times New Roman"/>
-          <w:color w:val="1F2328"/>
-          <w:kern w:val="0"/>
-          <w14:ligatures w14:val="none"/>
-        </w:rPr>
-        <w:t>SQLAlchemy</w:t>
-      </w:r>
-      <w:proofErr w:type="spellEnd"/>
-      <w:r>
-        <w:rPr>
-          <w:rFonts w:ascii="Times New Roman" w:eastAsia="Times New Roman" w:hAnsi="Times New Roman" w:cs="Times New Roman"/>
-          <w:color w:val="1F2328"/>
-          <w:kern w:val="0"/>
-          <w14:ligatures w14:val="none"/>
-        </w:rPr>
-        <w:t xml:space="preserve"> to create a database to hold the hotel booking data, setting up communication with </w:t>
-      </w:r>
-      <w:proofErr w:type="spellStart"/>
-      <w:r>
-        <w:rPr>
-          <w:rFonts w:ascii="Times New Roman" w:eastAsia="Times New Roman" w:hAnsi="Times New Roman" w:cs="Times New Roman"/>
-          <w:color w:val="1F2328"/>
-          <w:kern w:val="0"/>
-          <w14:ligatures w14:val="none"/>
-        </w:rPr>
-        <w:t>SocketIO</w:t>
-      </w:r>
-      <w:proofErr w:type="spellEnd"/>
-      <w:r>
-        <w:rPr>
-          <w:rFonts w:ascii="Times New Roman" w:eastAsia="Times New Roman" w:hAnsi="Times New Roman" w:cs="Times New Roman"/>
-          <w:color w:val="1F2328"/>
-          <w:kern w:val="0"/>
-          <w14:ligatures w14:val="none"/>
-        </w:rPr>
-        <w:t xml:space="preserve"> so that live changes could be made, and setting up all webpages. She set up the booking webpage to create changes to the database and mark the hotels as booked, and the reader page which regularly queries the database for the latest data on all hotel bookings.</w:t>
+        <w:t>Primarily worked on the setup of the web server. This included setting up the flask environment using SQLAlchemy to create a database to hold the hotel booking data, setting up communication with SocketIO so that live changes could be made, and setting up all webpages. She set up the booking webpage to create changes to the database and mark the hotels as booked, and the reader page which regularly queries the database for the latest data on all hotel bookings.</w:t>
       </w:r>
     </w:p>
     <w:p>
@@ -1708,57 +1516,6 @@
       <w:pPr>
         <w:rPr>
           <w:rFonts w:ascii="Times New Roman" w:hAnsi="Times New Roman" w:cs="Times New Roman"/>
-        </w:rPr>
-      </w:pPr>
-      <w:r>
-        <w:rPr>
-          <w:rFonts w:ascii="Times New Roman" w:hAnsi="Times New Roman" w:cs="Times New Roman"/>
-        </w:rPr>
-        <w:t xml:space="preserve">When testing the interaction between reader and writer threads, sometimes there would be a deadlock where writers would wait forever and since there was a writer waiting to run, new reader threads also waited. This is due to a natural problem with servers where some requests either fail or stall. So, when a reader thread attempts to but fails to access the database, the system halts. This was fixed with a simple try block around the critical section and a finally block around the exit section to allow failed accesses of the database to still update the number of threads in the system. Another issue was that the python Threading library does not allow threads to return a value to be assigned to another variable. This was important for the reader threads generated by ping since this was needed to properly display the data. </w:t>
-      </w:r>
-      <w:proofErr w:type="spellStart"/>
-      <w:r>
-        <w:rPr>
-          <w:rFonts w:ascii="Times New Roman" w:hAnsi="Times New Roman" w:cs="Times New Roman"/>
-        </w:rPr>
-        <w:t>ThreadPoolExecutor</w:t>
-      </w:r>
-      <w:proofErr w:type="spellEnd"/>
-      <w:r>
-        <w:rPr>
-          <w:rFonts w:ascii="Times New Roman" w:hAnsi="Times New Roman" w:cs="Times New Roman"/>
-        </w:rPr>
-        <w:t xml:space="preserve"> was used as the solution since it allows </w:t>
-      </w:r>
-      <w:r>
-        <w:rPr>
-          <w:rFonts w:ascii="Times New Roman" w:hAnsi="Times New Roman" w:cs="Times New Roman"/>
-        </w:rPr>
-        <w:t>this function.</w:t>
-      </w:r>
-    </w:p>
-    <w:p>
-      <w:pPr>
-        <w:rPr>
-          <w:rFonts w:ascii="Times New Roman" w:hAnsi="Times New Roman" w:cs="Times New Roman"/>
-          <w:sz w:val="40"/>
-          <w:szCs w:val="40"/>
-        </w:rPr>
-      </w:pPr>
-      <w:r>
-        <w:rPr>
-          <w:rFonts w:ascii="Times New Roman" w:hAnsi="Times New Roman" w:cs="Times New Roman"/>
-          <w:sz w:val="40"/>
-          <w:szCs w:val="40"/>
-        </w:rPr>
-        <w:lastRenderedPageBreak/>
-        <w:t>Experimental Setting:</w:t>
-      </w:r>
-    </w:p>
-    <w:p>
-      <w:pPr>
-        <w:rPr>
-          <w:rFonts w:ascii="Times New Roman" w:hAnsi="Times New Roman" w:cs="Times New Roman"/>
           <w:color w:val="EE0000"/>
           <w:sz w:val="40"/>
           <w:szCs w:val="40"/>
@@ -1778,6 +1535,32 @@
       <w:pPr>
         <w:rPr>
           <w:rFonts w:ascii="Times New Roman" w:hAnsi="Times New Roman" w:cs="Times New Roman"/>
+        </w:rPr>
+      </w:pPr>
+      <w:r>
+        <w:rPr>
+          <w:rFonts w:ascii="Times New Roman" w:hAnsi="Times New Roman" w:cs="Times New Roman"/>
+        </w:rPr>
+        <w:t xml:space="preserve">When testing the interaction between reader and writer threads, sometimes there would be a deadlock where writers would wait forever and since there was a writer waiting to run, new reader threads also waited. This is due to a natural problem with servers where some requests either fail or stall. So, when a reader thread attempts to but fails to access the database, the system halts. This was fixed with a simple try block around the critical section and a finally block around the exit section to allow failed accesses of the database to still update the number of threads in the system. Another issue was that the python Threading library does not allow threads to return a value to be assigned to another variable. This was important for the reader </w:t>
+      </w:r>
+      <w:r>
+        <w:rPr>
+          <w:rFonts w:ascii="Times New Roman" w:hAnsi="Times New Roman" w:cs="Times New Roman"/>
+        </w:rPr>
+        <w:lastRenderedPageBreak/>
+        <w:t xml:space="preserve">threads generated by ping since this was needed to properly display the data. ThreadPoolExecutor was used as the solution since it allows </w:t>
+      </w:r>
+      <w:r>
+        <w:rPr>
+          <w:rFonts w:ascii="Times New Roman" w:hAnsi="Times New Roman" w:cs="Times New Roman"/>
+        </w:rPr>
+        <w:t>this function.</w:t>
+      </w:r>
+    </w:p>
+    <w:p>
+      <w:pPr>
+        <w:rPr>
+          <w:rFonts w:ascii="Times New Roman" w:hAnsi="Times New Roman" w:cs="Times New Roman"/>
           <w:sz w:val="40"/>
           <w:szCs w:val="40"/>
         </w:rPr>
@@ -1788,6 +1571,42 @@
           <w:sz w:val="40"/>
           <w:szCs w:val="40"/>
         </w:rPr>
+        <w:t>Experimental Setting:</w:t>
+      </w:r>
+    </w:p>
+    <w:p>
+      <w:pPr>
+        <w:rPr>
+          <w:rFonts w:ascii="Times New Roman" w:hAnsi="Times New Roman" w:cs="Times New Roman"/>
+          <w:color w:val="EE0000"/>
+          <w:sz w:val="40"/>
+          <w:szCs w:val="40"/>
+        </w:rPr>
+      </w:pPr>
+      <w:r>
+        <w:rPr>
+          <w:rFonts w:ascii="Times New Roman" w:hAnsi="Times New Roman" w:cs="Times New Roman"/>
+          <w:color w:val="EE0000"/>
+          <w:sz w:val="40"/>
+          <w:szCs w:val="40"/>
+        </w:rPr>
+        <w:t>reminder</w:t>
+      </w:r>
+    </w:p>
+    <w:p>
+      <w:pPr>
+        <w:rPr>
+          <w:rFonts w:ascii="Times New Roman" w:hAnsi="Times New Roman" w:cs="Times New Roman"/>
+          <w:sz w:val="40"/>
+          <w:szCs w:val="40"/>
+        </w:rPr>
+      </w:pPr>
+      <w:r>
+        <w:rPr>
+          <w:rFonts w:ascii="Times New Roman" w:hAnsi="Times New Roman" w:cs="Times New Roman"/>
+          <w:sz w:val="40"/>
+          <w:szCs w:val="40"/>
+        </w:rPr>
         <w:t xml:space="preserve">Results Analysis: </w:t>
       </w:r>
     </w:p>
@@ -1821,6 +1640,7 @@
           <w:rFonts w:ascii="Times New Roman" w:hAnsi="Times New Roman" w:cs="Times New Roman"/>
           <w:noProof/>
         </w:rPr>
+        <w:lastRenderedPageBreak/>
         <w:drawing>
           <wp:inline distT="0" distB="0" distL="0" distR="0" wp14:anchorId="73CC37CB" wp14:editId="7A1C44FC">
             <wp:extent cx="5943600" cy="4901565"/>
@@ -1887,21 +1707,21 @@
         <w:rPr>
           <w:rFonts w:ascii="Times New Roman" w:hAnsi="Times New Roman" w:cs="Times New Roman"/>
         </w:rPr>
+        <w:t>Booking a room in the Booking Hotel page also correctly updates the database which can be viewed in the Hotel Monitoring Page. In both cases of writer threads booking a room, after the entered amount of time another writer thread is created to update the room booking time back to 0.</w:t>
+      </w:r>
+    </w:p>
+    <w:p>
+      <w:pPr>
+        <w:rPr>
+          <w:rFonts w:ascii="Times New Roman" w:hAnsi="Times New Roman" w:cs="Times New Roman"/>
+        </w:rPr>
+      </w:pPr>
+      <w:r>
+        <w:rPr>
+          <w:rFonts w:ascii="Times New Roman" w:hAnsi="Times New Roman" w:cs="Times New Roman"/>
+          <w:noProof/>
+        </w:rPr>
         <w:lastRenderedPageBreak/>
-        <w:t>Booking a room in the Booking Hotel page also correctly updates the database which can be viewed in the Hotel Monitoring Page. In both cases of writer threads booking a room, after the entered amount of time another writer thread is created to update the room booking time back to 0.</w:t>
-      </w:r>
-    </w:p>
-    <w:p>
-      <w:pPr>
-        <w:rPr>
-          <w:rFonts w:ascii="Times New Roman" w:hAnsi="Times New Roman" w:cs="Times New Roman"/>
-        </w:rPr>
-      </w:pPr>
-      <w:r>
-        <w:rPr>
-          <w:rFonts w:ascii="Times New Roman" w:hAnsi="Times New Roman" w:cs="Times New Roman"/>
-          <w:noProof/>
-        </w:rPr>
         <w:drawing>
           <wp:inline distT="0" distB="0" distL="0" distR="0" wp14:anchorId="03AA48DF" wp14:editId="16022EFE">
             <wp:extent cx="5943600" cy="3727450"/>
@@ -1987,14 +1807,12 @@
         </w:rPr>
         <w:t xml:space="preserve">Future work on the project could include implementing other approaches to the reader-writer problem such as reader priority or a balance approach. This could demonstrate the difference visually to help improve understanding of the differences between the approaches. Examples could </w:t>
       </w:r>
-      <w:proofErr w:type="gramStart"/>
-      <w:r>
-        <w:rPr>
-          <w:rFonts w:ascii="Times New Roman" w:hAnsi="Times New Roman" w:cs="Times New Roman"/>
-        </w:rPr>
-        <w:t>added</w:t>
-      </w:r>
-      <w:proofErr w:type="gramEnd"/>
+      <w:r>
+        <w:rPr>
+          <w:rFonts w:ascii="Times New Roman" w:hAnsi="Times New Roman" w:cs="Times New Roman"/>
+        </w:rPr>
+        <w:t>add</w:t>
+      </w:r>
       <w:r>
         <w:rPr>
           <w:rFonts w:ascii="Times New Roman" w:hAnsi="Times New Roman" w:cs="Times New Roman"/>
@@ -2102,7 +1920,6 @@
               </w:rPr>
               <w:t>B. Akash. 2025. Python Flask - Request Object. </w:t>
             </w:r>
-            <w:proofErr w:type="spellStart"/>
             <w:r>
               <w:rPr>
                 <w:rFonts w:ascii="Times New Roman" w:eastAsia="Times New Roman" w:hAnsi="Times New Roman" w:cs="Times New Roman"/>
@@ -2113,7 +1930,6 @@
               </w:rPr>
               <w:t>GeeksforGeeks</w:t>
             </w:r>
-            <w:proofErr w:type="spellEnd"/>
             <w:r>
               <w:rPr>
                 <w:rFonts w:ascii="Times New Roman" w:eastAsia="Times New Roman" w:hAnsi="Times New Roman" w:cs="Times New Roman"/>
@@ -2146,7 +1962,6 @@
                 <w:kern w:val="0"/>
                 <w14:ligatures w14:val="none"/>
               </w:rPr>
-              <w:lastRenderedPageBreak/>
               <w:t>[2]</w:t>
             </w:r>
           </w:p>
@@ -2171,25 +1986,7 @@
                 <w:kern w:val="0"/>
                 <w14:ligatures w14:val="none"/>
               </w:rPr>
-              <w:t xml:space="preserve">Michael Bayer et Al. 2026. </w:t>
-            </w:r>
-            <w:proofErr w:type="spellStart"/>
-            <w:r>
-              <w:rPr>
-                <w:rFonts w:ascii="Times New Roman" w:eastAsia="Times New Roman" w:hAnsi="Times New Roman" w:cs="Times New Roman"/>
-                <w:kern w:val="0"/>
-                <w14:ligatures w14:val="none"/>
-              </w:rPr>
-              <w:t>SQLAlchemy</w:t>
-            </w:r>
-            <w:proofErr w:type="spellEnd"/>
-            <w:r>
-              <w:rPr>
-                <w:rFonts w:ascii="Times New Roman" w:eastAsia="Times New Roman" w:hAnsi="Times New Roman" w:cs="Times New Roman"/>
-                <w:kern w:val="0"/>
-                <w14:ligatures w14:val="none"/>
-              </w:rPr>
-              <w:t xml:space="preserve"> 2.0 Documentation. </w:t>
+              <w:t>Michael Bayer et Al. 2026. SQLAlchemy 2.0 Documentation. </w:t>
             </w:r>
             <w:r>
               <w:rPr>
@@ -2257,43 +2054,7 @@
                 <w:kern w:val="0"/>
                 <w14:ligatures w14:val="none"/>
               </w:rPr>
-              <w:t xml:space="preserve">Miguel Grinberg. 2014. Easy </w:t>
-            </w:r>
-            <w:proofErr w:type="spellStart"/>
-            <w:r>
-              <w:rPr>
-                <w:rFonts w:ascii="Times New Roman" w:eastAsia="Times New Roman" w:hAnsi="Times New Roman" w:cs="Times New Roman"/>
-                <w:kern w:val="0"/>
-                <w14:ligatures w14:val="none"/>
-              </w:rPr>
-              <w:t>WebSockets</w:t>
-            </w:r>
-            <w:proofErr w:type="spellEnd"/>
-            <w:r>
-              <w:rPr>
-                <w:rFonts w:ascii="Times New Roman" w:eastAsia="Times New Roman" w:hAnsi="Times New Roman" w:cs="Times New Roman"/>
-                <w:kern w:val="0"/>
-                <w14:ligatures w14:val="none"/>
-              </w:rPr>
-              <w:t xml:space="preserve"> with Flask and </w:t>
-            </w:r>
-            <w:proofErr w:type="spellStart"/>
-            <w:r>
-              <w:rPr>
-                <w:rFonts w:ascii="Times New Roman" w:eastAsia="Times New Roman" w:hAnsi="Times New Roman" w:cs="Times New Roman"/>
-                <w:kern w:val="0"/>
-                <w14:ligatures w14:val="none"/>
-              </w:rPr>
-              <w:t>Gevent</w:t>
-            </w:r>
-            <w:proofErr w:type="spellEnd"/>
-            <w:r>
-              <w:rPr>
-                <w:rFonts w:ascii="Times New Roman" w:eastAsia="Times New Roman" w:hAnsi="Times New Roman" w:cs="Times New Roman"/>
-                <w:kern w:val="0"/>
-                <w14:ligatures w14:val="none"/>
-              </w:rPr>
-              <w:t>. </w:t>
+              <w:t>Miguel Grinberg. 2014. Easy WebSockets with Flask and Gevent. </w:t>
             </w:r>
             <w:r>
               <w:rPr>
@@ -2337,6 +2098,7 @@
                 <w:kern w:val="0"/>
                 <w14:ligatures w14:val="none"/>
               </w:rPr>
+              <w:lastRenderedPageBreak/>
               <w:t>[4]</w:t>
             </w:r>
           </w:p>
@@ -2371,20 +2133,8 @@
                 <w:kern w:val="0"/>
                 <w14:ligatures w14:val="none"/>
               </w:rPr>
-              <w:t>Flask-</w:t>
-            </w:r>
-            <w:proofErr w:type="spellStart"/>
-            <w:r>
-              <w:rPr>
-                <w:rFonts w:ascii="Times New Roman" w:eastAsia="Times New Roman" w:hAnsi="Times New Roman" w:cs="Times New Roman"/>
-                <w:i/>
-                <w:iCs/>
-                <w:kern w:val="0"/>
-                <w14:ligatures w14:val="none"/>
-              </w:rPr>
-              <w:t>Societio.ReadtheDocs</w:t>
-            </w:r>
-            <w:proofErr w:type="spellEnd"/>
+              <w:t>Flask-Societio.ReadtheDocs</w:t>
+            </w:r>
             <w:r>
               <w:rPr>
                 <w:rFonts w:ascii="Times New Roman" w:eastAsia="Times New Roman" w:hAnsi="Times New Roman" w:cs="Times New Roman"/>
@@ -2443,7 +2193,6 @@
               </w:rPr>
               <w:t>Khushi Gupta. 2025. Convert Python List to JSON. </w:t>
             </w:r>
-            <w:proofErr w:type="spellStart"/>
             <w:r>
               <w:rPr>
                 <w:rFonts w:ascii="Times New Roman" w:eastAsia="Times New Roman" w:hAnsi="Times New Roman" w:cs="Times New Roman"/>
@@ -2454,7 +2203,6 @@
               </w:rPr>
               <w:t>GeeksforGeeks</w:t>
             </w:r>
-            <w:proofErr w:type="spellEnd"/>
             <w:r>
               <w:rPr>
                 <w:rFonts w:ascii="Times New Roman" w:eastAsia="Times New Roman" w:hAnsi="Times New Roman" w:cs="Times New Roman"/>
@@ -2511,27 +2259,8 @@
                 <w:kern w:val="0"/>
                 <w14:ligatures w14:val="none"/>
               </w:rPr>
-              <w:t xml:space="preserve">Lito Nicolai. 2021. The basics of role-based access control in </w:t>
-            </w:r>
-            <w:proofErr w:type="spellStart"/>
-            <w:r>
-              <w:rPr>
-                <w:rFonts w:ascii="Times New Roman" w:eastAsia="Times New Roman" w:hAnsi="Times New Roman" w:cs="Times New Roman"/>
-                <w:kern w:val="0"/>
-                <w14:ligatures w14:val="none"/>
-              </w:rPr>
-              <w:t>SQLAlchemy</w:t>
-            </w:r>
-            <w:proofErr w:type="spellEnd"/>
-            <w:r>
-              <w:rPr>
-                <w:rFonts w:ascii="Times New Roman" w:eastAsia="Times New Roman" w:hAnsi="Times New Roman" w:cs="Times New Roman"/>
-                <w:kern w:val="0"/>
-                <w14:ligatures w14:val="none"/>
-              </w:rPr>
-              <w:t>. </w:t>
-            </w:r>
-            <w:proofErr w:type="spellStart"/>
+              <w:t>Lito Nicolai. 2021. The basics of role-based access control in SQLAlchemy. </w:t>
+            </w:r>
             <w:r>
               <w:rPr>
                 <w:rFonts w:ascii="Times New Roman" w:eastAsia="Times New Roman" w:hAnsi="Times New Roman" w:cs="Times New Roman"/>
@@ -2542,7 +2271,6 @@
               </w:rPr>
               <w:t>OsoHQ</w:t>
             </w:r>
-            <w:proofErr w:type="spellEnd"/>
             <w:r>
               <w:rPr>
                 <w:rFonts w:ascii="Times New Roman" w:eastAsia="Times New Roman" w:hAnsi="Times New Roman" w:cs="Times New Roman"/>
@@ -2599,27 +2327,8 @@
                 <w:kern w:val="0"/>
                 <w14:ligatures w14:val="none"/>
               </w:rPr>
-              <w:t xml:space="preserve">Amit Pathak. 2023. Querying and selecting specific column in </w:t>
-            </w:r>
-            <w:proofErr w:type="spellStart"/>
-            <w:r>
-              <w:rPr>
-                <w:rFonts w:ascii="Times New Roman" w:eastAsia="Times New Roman" w:hAnsi="Times New Roman" w:cs="Times New Roman"/>
-                <w:kern w:val="0"/>
-                <w14:ligatures w14:val="none"/>
-              </w:rPr>
-              <w:t>SQLAlchemy</w:t>
-            </w:r>
-            <w:proofErr w:type="spellEnd"/>
-            <w:r>
-              <w:rPr>
-                <w:rFonts w:ascii="Times New Roman" w:eastAsia="Times New Roman" w:hAnsi="Times New Roman" w:cs="Times New Roman"/>
-                <w:kern w:val="0"/>
-                <w14:ligatures w14:val="none"/>
-              </w:rPr>
-              <w:t>. </w:t>
-            </w:r>
-            <w:proofErr w:type="spellStart"/>
+              <w:t>Amit Pathak. 2023. Querying and selecting specific column in SQLAlchemy. </w:t>
+            </w:r>
             <w:r>
               <w:rPr>
                 <w:rFonts w:ascii="Times New Roman" w:eastAsia="Times New Roman" w:hAnsi="Times New Roman" w:cs="Times New Roman"/>
@@ -2630,7 +2339,6 @@
               </w:rPr>
               <w:t>GeeksforGeeks</w:t>
             </w:r>
-            <w:proofErr w:type="spellEnd"/>
             <w:r>
               <w:rPr>
                 <w:rFonts w:ascii="Times New Roman" w:eastAsia="Times New Roman" w:hAnsi="Times New Roman" w:cs="Times New Roman"/>
@@ -2687,27 +2395,8 @@
                 <w:kern w:val="0"/>
                 <w14:ligatures w14:val="none"/>
               </w:rPr>
-              <w:t xml:space="preserve">Amit Pathak. 2024. </w:t>
-            </w:r>
-            <w:proofErr w:type="spellStart"/>
-            <w:r>
-              <w:rPr>
-                <w:rFonts w:ascii="Times New Roman" w:eastAsia="Times New Roman" w:hAnsi="Times New Roman" w:cs="Times New Roman"/>
-                <w:kern w:val="0"/>
-                <w14:ligatures w14:val="none"/>
-              </w:rPr>
-              <w:t>SQLAlchemy</w:t>
-            </w:r>
-            <w:proofErr w:type="spellEnd"/>
-            <w:r>
-              <w:rPr>
-                <w:rFonts w:ascii="Times New Roman" w:eastAsia="Times New Roman" w:hAnsi="Times New Roman" w:cs="Times New Roman"/>
-                <w:kern w:val="0"/>
-                <w14:ligatures w14:val="none"/>
-              </w:rPr>
-              <w:t xml:space="preserve"> Core - Creating Table. </w:t>
-            </w:r>
-            <w:proofErr w:type="spellStart"/>
+              <w:t>Amit Pathak. 2024. SQLAlchemy Core - Creating Table. </w:t>
+            </w:r>
             <w:r>
               <w:rPr>
                 <w:rFonts w:ascii="Times New Roman" w:eastAsia="Times New Roman" w:hAnsi="Times New Roman" w:cs="Times New Roman"/>
@@ -2718,7 +2407,6 @@
               </w:rPr>
               <w:t>GeeksforGeeks</w:t>
             </w:r>
-            <w:proofErr w:type="spellEnd"/>
             <w:r>
               <w:rPr>
                 <w:rFonts w:ascii="Times New Roman" w:eastAsia="Times New Roman" w:hAnsi="Times New Roman" w:cs="Times New Roman"/>
@@ -2777,7 +2465,6 @@
               </w:rPr>
               <w:t>Kushwanth Reddy. 2025. Retrieving HTML Form data using Flask. </w:t>
             </w:r>
-            <w:proofErr w:type="spellStart"/>
             <w:r>
               <w:rPr>
                 <w:rFonts w:ascii="Times New Roman" w:eastAsia="Times New Roman" w:hAnsi="Times New Roman" w:cs="Times New Roman"/>
@@ -2788,7 +2475,6 @@
               </w:rPr>
               <w:t>GeeksforGeeks</w:t>
             </w:r>
-            <w:proofErr w:type="spellEnd"/>
             <w:r>
               <w:rPr>
                 <w:rFonts w:ascii="Times New Roman" w:eastAsia="Times New Roman" w:hAnsi="Times New Roman" w:cs="Times New Roman"/>
@@ -2847,7 +2533,6 @@
               </w:rPr>
               <w:t>Kartikeya Shukla. 2026. Introduction to Web development using Flask. </w:t>
             </w:r>
-            <w:proofErr w:type="spellStart"/>
             <w:r>
               <w:rPr>
                 <w:rFonts w:ascii="Times New Roman" w:eastAsia="Times New Roman" w:hAnsi="Times New Roman" w:cs="Times New Roman"/>
@@ -2858,7 +2543,6 @@
               </w:rPr>
               <w:t>GeeksforGeeks</w:t>
             </w:r>
-            <w:proofErr w:type="spellEnd"/>
             <w:r>
               <w:rPr>
                 <w:rFonts w:ascii="Times New Roman" w:eastAsia="Times New Roman" w:hAnsi="Times New Roman" w:cs="Times New Roman"/>
@@ -2917,7 +2601,6 @@
               </w:rPr>
               <w:t>Sachidanand Thakur. 2025. Creating Instance Objects in Python. </w:t>
             </w:r>
-            <w:proofErr w:type="spellStart"/>
             <w:r>
               <w:rPr>
                 <w:rFonts w:ascii="Times New Roman" w:eastAsia="Times New Roman" w:hAnsi="Times New Roman" w:cs="Times New Roman"/>
@@ -2928,7 +2611,6 @@
               </w:rPr>
               <w:t>GeeksforGeeks</w:t>
             </w:r>
-            <w:proofErr w:type="spellEnd"/>
             <w:r>
               <w:rPr>
                 <w:rFonts w:ascii="Times New Roman" w:eastAsia="Times New Roman" w:hAnsi="Times New Roman" w:cs="Times New Roman"/>
@@ -3047,25 +2729,14 @@
                 <w14:ligatures w14:val="none"/>
               </w:rPr>
             </w:pPr>
-            <w:proofErr w:type="spellStart"/>
-            <w:r>
-              <w:rPr>
-                <w:rFonts w:ascii="Times New Roman" w:eastAsia="Times New Roman" w:hAnsi="Times New Roman" w:cs="Times New Roman"/>
-                <w:kern w:val="0"/>
-                <w14:ligatures w14:val="none"/>
-              </w:rPr>
-              <w:t>TutorialsPoint</w:t>
-            </w:r>
-            <w:proofErr w:type="spellEnd"/>
-            <w:r>
-              <w:rPr>
-                <w:rFonts w:ascii="Times New Roman" w:eastAsia="Times New Roman" w:hAnsi="Times New Roman" w:cs="Times New Roman"/>
-                <w:kern w:val="0"/>
-                <w14:ligatures w14:val="none"/>
-              </w:rPr>
-              <w:t xml:space="preserve"> Team. SQLite - Commands. </w:t>
-            </w:r>
-            <w:proofErr w:type="spellStart"/>
+            <w:r>
+              <w:rPr>
+                <w:rFonts w:ascii="Times New Roman" w:eastAsia="Times New Roman" w:hAnsi="Times New Roman" w:cs="Times New Roman"/>
+                <w:kern w:val="0"/>
+                <w14:ligatures w14:val="none"/>
+              </w:rPr>
+              <w:t>TutorialsPoint Team. SQLite - Commands. </w:t>
+            </w:r>
             <w:r>
               <w:rPr>
                 <w:rFonts w:ascii="Times New Roman" w:eastAsia="Times New Roman" w:hAnsi="Times New Roman" w:cs="Times New Roman"/>
@@ -3076,7 +2747,6 @@
               </w:rPr>
               <w:t>tutorialspoint</w:t>
             </w:r>
-            <w:proofErr w:type="spellEnd"/>
             <w:r>
               <w:rPr>
                 <w:rFonts w:ascii="Times New Roman" w:eastAsia="Times New Roman" w:hAnsi="Times New Roman" w:cs="Times New Roman"/>
@@ -3135,7 +2805,6 @@
               </w:rPr>
               <w:t>Anish Singh Walia. 2020. How To Build a Web Application Using Flask in Python 3. </w:t>
             </w:r>
-            <w:proofErr w:type="spellStart"/>
             <w:r>
               <w:rPr>
                 <w:rFonts w:ascii="Times New Roman" w:eastAsia="Times New Roman" w:hAnsi="Times New Roman" w:cs="Times New Roman"/>
@@ -3146,7 +2815,6 @@
               </w:rPr>
               <w:t>DigitalOcean</w:t>
             </w:r>
-            <w:proofErr w:type="spellEnd"/>
             <w:r>
               <w:rPr>
                 <w:rFonts w:ascii="Times New Roman" w:eastAsia="Times New Roman" w:hAnsi="Times New Roman" w:cs="Times New Roman"/>
@@ -3205,7 +2873,6 @@
               </w:rPr>
               <w:t>Muhammad Waseem. 2024. Flask and Flask-Login: A Guide to Building Secure Web Applications. </w:t>
             </w:r>
-            <w:proofErr w:type="spellStart"/>
             <w:r>
               <w:rPr>
                 <w:rFonts w:ascii="Times New Roman" w:eastAsia="Times New Roman" w:hAnsi="Times New Roman" w:cs="Times New Roman"/>
@@ -3214,18 +2881,7 @@
                 <w:kern w:val="0"/>
                 <w14:ligatures w14:val="none"/>
               </w:rPr>
-              <w:t>Intersystems</w:t>
-            </w:r>
-            <w:proofErr w:type="spellEnd"/>
-            <w:r>
-              <w:rPr>
-                <w:rFonts w:ascii="Times New Roman" w:eastAsia="Times New Roman" w:hAnsi="Times New Roman" w:cs="Times New Roman"/>
-                <w:i/>
-                <w:iCs/>
-                <w:kern w:val="0"/>
-                <w14:ligatures w14:val="none"/>
-              </w:rPr>
-              <w:t xml:space="preserve"> Developer Community</w:t>
+              <w:t>Intersystems Developer Community</w:t>
             </w:r>
             <w:r>
               <w:rPr>
@@ -3261,21 +2917,7 @@
         <w:rPr>
           <w:rFonts w:ascii="Times New Roman" w:hAnsi="Times New Roman" w:cs="Times New Roman"/>
         </w:rPr>
-        <w:t>] “</w:t>
-      </w:r>
-      <w:proofErr w:type="spellStart"/>
-      <w:r>
-        <w:rPr>
-          <w:rFonts w:ascii="Times New Roman" w:hAnsi="Times New Roman" w:cs="Times New Roman"/>
-        </w:rPr>
-        <w:t>Concurrent.futures</w:t>
-      </w:r>
-      <w:proofErr w:type="spellEnd"/>
-      <w:r>
-        <w:rPr>
-          <w:rFonts w:ascii="Times New Roman" w:hAnsi="Times New Roman" w:cs="Times New Roman"/>
-        </w:rPr>
-        <w:t xml:space="preserve"> - launching parallel tasks,” Python documentation, https://docs.python.org/3/library/concurrent.futures.html (accessed May 12, 2026).  </w:t>
+        <w:t xml:space="preserve">] “Concurrent.futures - launching parallel tasks,” Python documentation, https://docs.python.org/3/library/concurrent.futures.html (accessed May 12, 2026).  </w:t>
       </w:r>
     </w:p>
     <w:p>
@@ -3890,6 +3532,7 @@
   <w:style w:type="paragraph" w:default="1" w:styleId="Normal">
     <w:name w:val="Normal"/>
     <w:qFormat/>
+    <w:rsid w:val="00A0208C"/>
   </w:style>
   <w:style w:type="paragraph" w:styleId="Heading1">
     <w:name w:val="heading 1"/>

</xml_diff>

<commit_message>
fixed typos in report
</commit_message>
<xml_diff>
--- a/Python_Server/flask_blog/static/Report/FinalReport.docx
+++ b/Python_Server/flask_blog/static/Report/FinalReport.docx
@@ -717,20 +717,8 @@
           <w:bdr w:val="none" w:sz="0" w:space="0" w:color="auto" w:frame="1"/>
           <w14:ligatures w14:val="none"/>
         </w:rPr>
-        <w:t xml:space="preserve">pip install </w:t>
-      </w:r>
-      <w:proofErr w:type="spellStart"/>
-      <w:r>
-        <w:rPr>
-          <w:rFonts w:ascii="Times New Roman" w:eastAsia="Times New Roman" w:hAnsi="Times New Roman" w:cs="Times New Roman"/>
-          <w:color w:val="1F2328"/>
-          <w:kern w:val="0"/>
-          <w:bdr w:val="none" w:sz="0" w:space="0" w:color="auto" w:frame="1"/>
-          <w14:ligatures w14:val="none"/>
-        </w:rPr>
-        <w:t>flask_sqlalchemy</w:t>
-      </w:r>
-      <w:proofErr w:type="spellEnd"/>
+        <w:t>pip install flask_sqlalchemy</w:t>
+      </w:r>
     </w:p>
     <w:p>
       <w:pPr>
@@ -771,20 +759,8 @@
           <w14:ligatures w14:val="none"/>
         </w:rPr>
         <w:lastRenderedPageBreak/>
-        <w:t xml:space="preserve">pip install </w:t>
-      </w:r>
-      <w:proofErr w:type="spellStart"/>
-      <w:r>
-        <w:rPr>
-          <w:rFonts w:ascii="Times New Roman" w:eastAsia="Times New Roman" w:hAnsi="Times New Roman" w:cs="Times New Roman"/>
-          <w:color w:val="1F2328"/>
-          <w:kern w:val="0"/>
-          <w:bdr w:val="none" w:sz="0" w:space="0" w:color="auto" w:frame="1"/>
-          <w14:ligatures w14:val="none"/>
-        </w:rPr>
-        <w:t>flask_security</w:t>
-      </w:r>
-      <w:proofErr w:type="spellEnd"/>
+        <w:t>pip install flask_security</w:t>
+      </w:r>
     </w:p>
     <w:p>
       <w:pPr>
@@ -824,20 +800,8 @@
           <w:bdr w:val="none" w:sz="0" w:space="0" w:color="auto" w:frame="1"/>
           <w14:ligatures w14:val="none"/>
         </w:rPr>
-        <w:t xml:space="preserve">pip install </w:t>
-      </w:r>
-      <w:proofErr w:type="spellStart"/>
-      <w:r>
-        <w:rPr>
-          <w:rFonts w:ascii="Times New Roman" w:eastAsia="Times New Roman" w:hAnsi="Times New Roman" w:cs="Times New Roman"/>
-          <w:color w:val="1F2328"/>
-          <w:kern w:val="0"/>
-          <w:bdr w:val="none" w:sz="0" w:space="0" w:color="auto" w:frame="1"/>
-          <w14:ligatures w14:val="none"/>
-        </w:rPr>
-        <w:t>flask_socketio</w:t>
-      </w:r>
-      <w:proofErr w:type="spellEnd"/>
+        <w:t>pip install flask_socketio</w:t>
+      </w:r>
     </w:p>
     <w:p>
       <w:pPr>
@@ -910,27 +874,7 @@
           <w:kern w:val="0"/>
           <w14:ligatures w14:val="none"/>
         </w:rPr>
-        <w:t xml:space="preserve">Finally, navigate to the </w:t>
-      </w:r>
-      <w:proofErr w:type="spellStart"/>
-      <w:r>
-        <w:rPr>
-          <w:rFonts w:ascii="Times New Roman" w:eastAsia="Times New Roman" w:hAnsi="Times New Roman" w:cs="Times New Roman"/>
-          <w:color w:val="1F2328"/>
-          <w:kern w:val="0"/>
-          <w14:ligatures w14:val="none"/>
-        </w:rPr>
-        <w:t>flask_blog</w:t>
-      </w:r>
-      <w:proofErr w:type="spellEnd"/>
-      <w:r>
-        <w:rPr>
-          <w:rFonts w:ascii="Times New Roman" w:eastAsia="Times New Roman" w:hAnsi="Times New Roman" w:cs="Times New Roman"/>
-          <w:color w:val="1F2328"/>
-          <w:kern w:val="0"/>
-          <w14:ligatures w14:val="none"/>
-        </w:rPr>
-        <w:t>/ directory and run the following command:</w:t>
+        <w:t>Finally, navigate to the flask_blog/ directory and run the following command:</w:t>
       </w:r>
     </w:p>
     <w:p>
@@ -1009,8 +953,6 @@
           <w:bdr w:val="none" w:sz="0" w:space="0" w:color="auto" w:frame="1"/>
         </w:rPr>
       </w:pPr>
-      <w:proofErr w:type="spellStart"/>
-      <w:proofErr w:type="gramStart"/>
       <w:r>
         <w:rPr>
           <w:rStyle w:val="HTMLCode"/>
@@ -1020,10 +962,13 @@
           <w:szCs w:val="24"/>
           <w:bdr w:val="none" w:sz="0" w:space="0" w:color="auto" w:frame="1"/>
         </w:rPr>
-        <w:t>INFO:werkzeug</w:t>
-      </w:r>
-      <w:proofErr w:type="gramEnd"/>
-      <w:r>
+        <w:t>INFO:werkzeug:WARNING: This is a development server. Do not use it in a production deployment. Use a production WSGI server instead.</w:t>
+      </w:r>
+    </w:p>
+    <w:p>
+      <w:pPr>
+        <w:pStyle w:val="HTMLPreformatted"/>
+        <w:shd w:val="clear" w:color="auto" w:fill="F6F8FA"/>
         <w:rPr>
           <w:rStyle w:val="HTMLCode"/>
           <w:rFonts w:ascii="Times New Roman" w:hAnsi="Times New Roman" w:cs="Times New Roman"/>
@@ -1032,9 +977,7 @@
           <w:szCs w:val="24"/>
           <w:bdr w:val="none" w:sz="0" w:space="0" w:color="auto" w:frame="1"/>
         </w:rPr>
-        <w:t>:WARNING</w:t>
-      </w:r>
-      <w:proofErr w:type="spellEnd"/>
+      </w:pPr>
       <w:r>
         <w:rPr>
           <w:rStyle w:val="HTMLCode"/>
@@ -1044,7 +987,7 @@
           <w:szCs w:val="24"/>
           <w:bdr w:val="none" w:sz="0" w:space="0" w:color="auto" w:frame="1"/>
         </w:rPr>
-        <w:t>: This is a development server. Do not use it in a production deployment. Use a production WSGI server instead.</w:t>
+        <w:t xml:space="preserve"> * Running on http://127.0.0.1:8080</w:t>
       </w:r>
     </w:p>
     <w:p>
@@ -1069,58 +1012,7 @@
           <w:szCs w:val="24"/>
           <w:bdr w:val="none" w:sz="0" w:space="0" w:color="auto" w:frame="1"/>
         </w:rPr>
-        <w:t xml:space="preserve"> * Running on http://127.0.0.1:8080</w:t>
-      </w:r>
-    </w:p>
-    <w:p>
-      <w:pPr>
-        <w:pStyle w:val="HTMLPreformatted"/>
-        <w:shd w:val="clear" w:color="auto" w:fill="F6F8FA"/>
-        <w:rPr>
-          <w:rStyle w:val="HTMLCode"/>
-          <w:rFonts w:ascii="Times New Roman" w:hAnsi="Times New Roman" w:cs="Times New Roman"/>
-          <w:color w:val="1F2328"/>
-          <w:sz w:val="24"/>
-          <w:szCs w:val="24"/>
-          <w:bdr w:val="none" w:sz="0" w:space="0" w:color="auto" w:frame="1"/>
-        </w:rPr>
-      </w:pPr>
-      <w:proofErr w:type="spellStart"/>
-      <w:proofErr w:type="gramStart"/>
-      <w:r>
-        <w:rPr>
-          <w:rStyle w:val="HTMLCode"/>
-          <w:rFonts w:ascii="Times New Roman" w:hAnsi="Times New Roman" w:cs="Times New Roman"/>
-          <w:color w:val="1F2328"/>
-          <w:sz w:val="24"/>
-          <w:szCs w:val="24"/>
-          <w:bdr w:val="none" w:sz="0" w:space="0" w:color="auto" w:frame="1"/>
-        </w:rPr>
-        <w:t>INFO:werkzeug</w:t>
-      </w:r>
-      <w:proofErr w:type="gramEnd"/>
-      <w:r>
-        <w:rPr>
-          <w:rStyle w:val="HTMLCode"/>
-          <w:rFonts w:ascii="Times New Roman" w:hAnsi="Times New Roman" w:cs="Times New Roman"/>
-          <w:color w:val="1F2328"/>
-          <w:sz w:val="24"/>
-          <w:szCs w:val="24"/>
-          <w:bdr w:val="none" w:sz="0" w:space="0" w:color="auto" w:frame="1"/>
-        </w:rPr>
-        <w:t>:Press</w:t>
-      </w:r>
-      <w:proofErr w:type="spellEnd"/>
-      <w:r>
-        <w:rPr>
-          <w:rStyle w:val="HTMLCode"/>
-          <w:rFonts w:ascii="Times New Roman" w:hAnsi="Times New Roman" w:cs="Times New Roman"/>
-          <w:color w:val="1F2328"/>
-          <w:sz w:val="24"/>
-          <w:szCs w:val="24"/>
-          <w:bdr w:val="none" w:sz="0" w:space="0" w:color="auto" w:frame="1"/>
-        </w:rPr>
-        <w:t xml:space="preserve"> CTRL+C to quit</w:t>
+        <w:t>INFO:werkzeug:Press CTRL+C to quit</w:t>
       </w:r>
     </w:p>
     <w:p>
@@ -1308,21 +1200,7 @@
           <w:rFonts w:ascii="Times New Roman" w:hAnsi="Times New Roman" w:cs="Times New Roman"/>
         </w:rPr>
         <w:lastRenderedPageBreak/>
-        <w:t xml:space="preserve">Underneath actions, there is the connection log. This gives test messages showing that the socket has connected. On the right is the main purpose of the page: hotel bookings. Here, there is a message showing the values of the database that generates every 2 or 3 seconds (this is randomly decided by a </w:t>
-      </w:r>
-      <w:proofErr w:type="gramStart"/>
-      <w:r>
-        <w:rPr>
-          <w:rFonts w:ascii="Times New Roman" w:hAnsi="Times New Roman" w:cs="Times New Roman"/>
-        </w:rPr>
-        <w:t>sleep(</w:t>
-      </w:r>
-      <w:proofErr w:type="gramEnd"/>
-      <w:r>
-        <w:rPr>
-          <w:rFonts w:ascii="Times New Roman" w:hAnsi="Times New Roman" w:cs="Times New Roman"/>
-        </w:rPr>
-        <w:t xml:space="preserve">) function).  </w:t>
+        <w:t xml:space="preserve">Underneath actions, there is the connection log. This gives test messages showing that the socket has connected. On the right is the main purpose of the page: hotel bookings. Here, there is a message showing the values of the database that generates every 2 or 3 seconds (this is randomly decided by a sleep() function).  </w:t>
       </w:r>
     </w:p>
     <w:p>
@@ -1590,21 +1468,7 @@
         <w:rPr>
           <w:color w:val="1F2328"/>
         </w:rPr>
-        <w:t>2.) @</w:t>
-      </w:r>
-      <w:proofErr w:type="gramStart"/>
-      <w:r>
-        <w:rPr>
-          <w:color w:val="1F2328"/>
-        </w:rPr>
-        <w:t>socketio.event</w:t>
-      </w:r>
-      <w:proofErr w:type="gramEnd"/>
-      <w:r>
-        <w:rPr>
-          <w:color w:val="1F2328"/>
-        </w:rPr>
-        <w:t xml:space="preserve"> functions, which use SocketIO to handle live changes to the HTML pages</w:t>
+        <w:t>2.) @socketio.event functions, which use SocketIO to handle live changes to the HTML pages</w:t>
       </w:r>
       <w:r>
         <w:rPr>
@@ -1646,79 +1510,7 @@
         <w:rPr>
           <w:color w:val="1F2328"/>
         </w:rPr>
-        <w:t xml:space="preserve"> or another function in app.py itself, using the function name and </w:t>
-      </w:r>
-      <w:proofErr w:type="spellStart"/>
-      <w:proofErr w:type="gramStart"/>
-      <w:r>
-        <w:rPr>
-          <w:color w:val="1F2328"/>
-        </w:rPr>
-        <w:t>socketio.emit</w:t>
-      </w:r>
-      <w:proofErr w:type="spellEnd"/>
-      <w:proofErr w:type="gramEnd"/>
-      <w:r>
-        <w:rPr>
-          <w:color w:val="1F2328"/>
-        </w:rPr>
-        <w:t>(&lt;</w:t>
-      </w:r>
-      <w:proofErr w:type="spellStart"/>
-      <w:r>
-        <w:rPr>
-          <w:color w:val="1F2328"/>
-        </w:rPr>
-        <w:t>function_name</w:t>
-      </w:r>
-      <w:proofErr w:type="spellEnd"/>
-      <w:r>
-        <w:rPr>
-          <w:color w:val="1F2328"/>
-        </w:rPr>
-        <w:t xml:space="preserve">&gt;). However, there are some standardized SocketIO events, such as </w:t>
-      </w:r>
-      <w:proofErr w:type="gramStart"/>
-      <w:r>
-        <w:rPr>
-          <w:color w:val="1F2328"/>
-        </w:rPr>
-        <w:t>connect(</w:t>
-      </w:r>
-      <w:proofErr w:type="gramEnd"/>
-      <w:r>
-        <w:rPr>
-          <w:color w:val="1F2328"/>
-        </w:rPr>
-        <w:t xml:space="preserve">) or </w:t>
-      </w:r>
-      <w:proofErr w:type="gramStart"/>
-      <w:r>
-        <w:rPr>
-          <w:color w:val="1F2328"/>
-        </w:rPr>
-        <w:t>disconnect(</w:t>
-      </w:r>
-      <w:proofErr w:type="gramEnd"/>
-      <w:r>
-        <w:rPr>
-          <w:color w:val="1F2328"/>
-        </w:rPr>
-        <w:t xml:space="preserve">) as well. </w:t>
-      </w:r>
-      <w:proofErr w:type="gramStart"/>
-      <w:r>
-        <w:rPr>
-          <w:color w:val="1F2328"/>
-        </w:rPr>
-        <w:t>Emit(</w:t>
-      </w:r>
-      <w:proofErr w:type="gramEnd"/>
-      <w:r>
-        <w:rPr>
-          <w:color w:val="1F2328"/>
-        </w:rPr>
-        <w:t>) can also be done to call an event on the .html pages within the Javascript, rather than solely to call a function within app.py</w:t>
+        <w:t xml:space="preserve"> or another function in app.py itself, using the function name and socketio.emit(&lt;function_name&gt;). However, there are some standardized SocketIO events, such as connect() or disconnect() as well. Emit() can also be done to call an event on the .html pages within the Javascript, rather than solely to call a function within app.py</w:t>
       </w:r>
     </w:p>
     <w:p>
@@ -1731,54 +1523,18 @@
           <w:color w:val="1F2328"/>
         </w:rPr>
       </w:pPr>
-      <w:proofErr w:type="gramStart"/>
       <w:r>
         <w:rPr>
           <w:color w:val="1F2328"/>
         </w:rPr>
         <w:lastRenderedPageBreak/>
-        <w:t>3.)@app.route</w:t>
-      </w:r>
-      <w:proofErr w:type="gramEnd"/>
-      <w:r>
-        <w:rPr>
-          <w:color w:val="1F2328"/>
-        </w:rPr>
-        <w:t xml:space="preserve">() functions, also known as views. These are called when the app navigates to a particular </w:t>
-      </w:r>
-      <w:r>
-        <w:rPr>
-          <w:color w:val="1F2328"/>
-        </w:rPr>
-        <w:t xml:space="preserve">URL within the application. These paths reflect their corresponding .HTML pages, which are called at the end of these functions using </w:t>
-      </w:r>
-      <w:proofErr w:type="spellStart"/>
-      <w:r>
-        <w:rPr>
-          <w:color w:val="1F2328"/>
-        </w:rPr>
-        <w:t>render_</w:t>
-      </w:r>
-      <w:proofErr w:type="gramStart"/>
-      <w:r>
-        <w:rPr>
-          <w:color w:val="1F2328"/>
-        </w:rPr>
-        <w:t>template</w:t>
-      </w:r>
-      <w:proofErr w:type="spellEnd"/>
-      <w:r>
-        <w:rPr>
-          <w:color w:val="1F2328"/>
-        </w:rPr>
-        <w:t>(</w:t>
-      </w:r>
-      <w:proofErr w:type="gramEnd"/>
-      <w:r>
-        <w:rPr>
-          <w:color w:val="1F2328"/>
-        </w:rPr>
-        <w:t xml:space="preserve">), with some exceptions such as errors, in which another template may be rendered instead. </w:t>
+        <w:t xml:space="preserve">3.)@app.route() functions, also known as views. These are called when the app navigates to a particular </w:t>
+      </w:r>
+      <w:r>
+        <w:rPr>
+          <w:color w:val="1F2328"/>
+        </w:rPr>
+        <w:t xml:space="preserve">URL within the application. These paths reflect their corresponding .HTML pages, which are called at the end of these functions using render_template(), with some exceptions such as errors, in which another template may be rendered instead. </w:t>
       </w:r>
     </w:p>
     <w:p>
@@ -1794,21 +1550,7 @@
         <w:rPr>
           <w:color w:val="1F2328"/>
         </w:rPr>
-        <w:t xml:space="preserve">Finally, there is a one-time setup of the database, including the user with writer permissions, and all hotel rooms within the Hotel model. </w:t>
-      </w:r>
-      <w:proofErr w:type="gramStart"/>
-      <w:r>
-        <w:rPr>
-          <w:color w:val="1F2328"/>
-        </w:rPr>
-        <w:t>Main(</w:t>
-      </w:r>
-      <w:proofErr w:type="gramEnd"/>
-      <w:r>
-        <w:rPr>
-          <w:color w:val="1F2328"/>
-        </w:rPr>
-        <w:t xml:space="preserve">) is then run, which simply runs the app on port 8080. </w:t>
+        <w:t xml:space="preserve">Finally, there is a one-time setup of the database, including the user with writer permissions, and all hotel rooms within the Hotel model. Main() is then run, which simply runs the app on port 8080. </w:t>
       </w:r>
     </w:p>
     <w:p>
@@ -1844,7 +1586,7 @@
         <w:rPr>
           <w:color w:val="1F2328"/>
         </w:rPr>
-        <w:t xml:space="preserve">The reader-writer logic was written using conditional variables and thread locks from the python Threading library. The approach taken for the reader-writer problem is writer-priority meaning that when a new writer thread enters the system, all active reader threads finish execution but any new reader threads that enter the system after while there are any writer threads executing or waiting must wait until all writer threads finish executing. </w:t>
+        <w:t xml:space="preserve">The reader-writer logic was written using conditional variables and thread locks from the python Threading library. The approach taken for the reader-writer problem is writer-priority meaning that when a new writer thread enters the system, all active reader threads finish execution but any new reader threads that enter the system while there are any writer threads executing or waiting must wait until all writer threads finish executing. </w:t>
       </w:r>
       <w:r>
         <w:rPr>
@@ -1880,19 +1622,11 @@
         </w:rPr>
         <w:t xml:space="preserve">For readers threads, if any writer threads are active or waiting, then the new reader thread must wait until all writer threads have left the system. This will also include new writer threads that enter while the reader threads are waiting. Writer threads must wait for all active readers to finish first and there is no other writer thread already executing. Once a thread is finished, they will signal the appropriate thread to start their execution with </w:t>
       </w:r>
-      <w:proofErr w:type="gramStart"/>
-      <w:r>
-        <w:rPr>
-          <w:color w:val="1F2328"/>
-        </w:rPr>
-        <w:t>notify(</w:t>
-      </w:r>
-      <w:proofErr w:type="gramEnd"/>
-      <w:r>
-        <w:rPr>
-          <w:color w:val="1F2328"/>
-        </w:rPr>
-        <w:t>)</w:t>
+      <w:r>
+        <w:rPr>
+          <w:color w:val="1F2328"/>
+        </w:rPr>
+        <w:t>notify()</w:t>
       </w:r>
       <w:r>
         <w:rPr>
@@ -1948,7 +1682,19 @@
         <w:rPr>
           <w:color w:val="1F2328"/>
         </w:rPr>
-        <w:t xml:space="preserve">implemented. When the button is clicked, a reader thread is generated to retrieve all names all the rooms in the hotel. After this, ten reader threads are created and are assigned a random room to retrieve the data for. Writer threads for each room in the hotel are created, with each having a random booking time between 20 and 40 seconds. Another group of writer threads are generated that wait </w:t>
+        <w:t>implemented. When the button is clicked, a reader thread is generated to retrieve all names</w:t>
+      </w:r>
+      <w:r>
+        <w:rPr>
+          <w:color w:val="1F2328"/>
+        </w:rPr>
+        <w:t xml:space="preserve"> of</w:t>
+      </w:r>
+      <w:r>
+        <w:rPr>
+          <w:color w:val="1F2328"/>
+        </w:rPr>
+        <w:t xml:space="preserve"> all the rooms in the hotel. After this, ten reader threads are created and are assigned a random room to retrieve the data for. Writer threads for each room in the hotel are created, with each having a random booking time between 20 and 40 seconds. Another group of writer threads are generated that wait </w:t>
       </w:r>
       <w:r>
         <w:rPr>
@@ -2622,7 +2368,6 @@
               </w:rPr>
               <w:t>B. Akash. 2025. Python Flask - Request Object. </w:t>
             </w:r>
-            <w:proofErr w:type="spellStart"/>
             <w:r>
               <w:rPr>
                 <w:rFonts w:ascii="Times New Roman" w:eastAsia="Times New Roman" w:hAnsi="Times New Roman" w:cs="Times New Roman"/>
@@ -2633,7 +2378,6 @@
               </w:rPr>
               <w:t>GeeksforGeeks</w:t>
             </w:r>
-            <w:proofErr w:type="spellEnd"/>
             <w:r>
               <w:rPr>
                 <w:rFonts w:ascii="Times New Roman" w:eastAsia="Times New Roman" w:hAnsi="Times New Roman" w:cs="Times New Roman"/>
@@ -2758,43 +2502,7 @@
                 <w:kern w:val="0"/>
                 <w14:ligatures w14:val="none"/>
               </w:rPr>
-              <w:t xml:space="preserve">Miguel Grinberg. 2014. Easy </w:t>
-            </w:r>
-            <w:proofErr w:type="spellStart"/>
-            <w:r>
-              <w:rPr>
-                <w:rFonts w:ascii="Times New Roman" w:eastAsia="Times New Roman" w:hAnsi="Times New Roman" w:cs="Times New Roman"/>
-                <w:kern w:val="0"/>
-                <w14:ligatures w14:val="none"/>
-              </w:rPr>
-              <w:t>WebSockets</w:t>
-            </w:r>
-            <w:proofErr w:type="spellEnd"/>
-            <w:r>
-              <w:rPr>
-                <w:rFonts w:ascii="Times New Roman" w:eastAsia="Times New Roman" w:hAnsi="Times New Roman" w:cs="Times New Roman"/>
-                <w:kern w:val="0"/>
-                <w14:ligatures w14:val="none"/>
-              </w:rPr>
-              <w:t xml:space="preserve"> with Flask and </w:t>
-            </w:r>
-            <w:proofErr w:type="spellStart"/>
-            <w:r>
-              <w:rPr>
-                <w:rFonts w:ascii="Times New Roman" w:eastAsia="Times New Roman" w:hAnsi="Times New Roman" w:cs="Times New Roman"/>
-                <w:kern w:val="0"/>
-                <w14:ligatures w14:val="none"/>
-              </w:rPr>
-              <w:t>Gevent</w:t>
-            </w:r>
-            <w:proofErr w:type="spellEnd"/>
-            <w:r>
-              <w:rPr>
-                <w:rFonts w:ascii="Times New Roman" w:eastAsia="Times New Roman" w:hAnsi="Times New Roman" w:cs="Times New Roman"/>
-                <w:kern w:val="0"/>
-                <w14:ligatures w14:val="none"/>
-              </w:rPr>
-              <w:t>. </w:t>
+              <w:t>Miguel Grinberg. 2014. Easy WebSockets with Flask and Gevent. </w:t>
             </w:r>
             <w:r>
               <w:rPr>
@@ -2872,20 +2580,8 @@
                 <w:kern w:val="0"/>
                 <w14:ligatures w14:val="none"/>
               </w:rPr>
-              <w:t>Flask-</w:t>
-            </w:r>
-            <w:proofErr w:type="spellStart"/>
-            <w:r>
-              <w:rPr>
-                <w:rFonts w:ascii="Times New Roman" w:eastAsia="Times New Roman" w:hAnsi="Times New Roman" w:cs="Times New Roman"/>
-                <w:i/>
-                <w:iCs/>
-                <w:kern w:val="0"/>
-                <w14:ligatures w14:val="none"/>
-              </w:rPr>
-              <w:t>Societio.ReadtheDocs</w:t>
-            </w:r>
-            <w:proofErr w:type="spellEnd"/>
+              <w:t>Flask-Societio.ReadtheDocs</w:t>
+            </w:r>
             <w:r>
               <w:rPr>
                 <w:rFonts w:ascii="Times New Roman" w:eastAsia="Times New Roman" w:hAnsi="Times New Roman" w:cs="Times New Roman"/>
@@ -2944,7 +2640,6 @@
               </w:rPr>
               <w:t>Khushi Gupta. 2025. Convert Python List to JSON. </w:t>
             </w:r>
-            <w:proofErr w:type="spellStart"/>
             <w:r>
               <w:rPr>
                 <w:rFonts w:ascii="Times New Roman" w:eastAsia="Times New Roman" w:hAnsi="Times New Roman" w:cs="Times New Roman"/>
@@ -2955,7 +2650,6 @@
               </w:rPr>
               <w:t>GeeksforGeeks</w:t>
             </w:r>
-            <w:proofErr w:type="spellEnd"/>
             <w:r>
               <w:rPr>
                 <w:rFonts w:ascii="Times New Roman" w:eastAsia="Times New Roman" w:hAnsi="Times New Roman" w:cs="Times New Roman"/>
@@ -3014,7 +2708,6 @@
               </w:rPr>
               <w:t>Lito Nicolai. 2021. The basics of role-based access control in SQLAlchemy. </w:t>
             </w:r>
-            <w:proofErr w:type="spellStart"/>
             <w:r>
               <w:rPr>
                 <w:rFonts w:ascii="Times New Roman" w:eastAsia="Times New Roman" w:hAnsi="Times New Roman" w:cs="Times New Roman"/>
@@ -3025,7 +2718,6 @@
               </w:rPr>
               <w:t>OsoHQ</w:t>
             </w:r>
-            <w:proofErr w:type="spellEnd"/>
             <w:r>
               <w:rPr>
                 <w:rFonts w:ascii="Times New Roman" w:eastAsia="Times New Roman" w:hAnsi="Times New Roman" w:cs="Times New Roman"/>
@@ -3084,7 +2776,6 @@
               </w:rPr>
               <w:t>Amit Pathak. 2023. Querying and selecting specific column in SQLAlchemy. </w:t>
             </w:r>
-            <w:proofErr w:type="spellStart"/>
             <w:r>
               <w:rPr>
                 <w:rFonts w:ascii="Times New Roman" w:eastAsia="Times New Roman" w:hAnsi="Times New Roman" w:cs="Times New Roman"/>
@@ -3095,7 +2786,6 @@
               </w:rPr>
               <w:t>GeeksforGeeks</w:t>
             </w:r>
-            <w:proofErr w:type="spellEnd"/>
             <w:r>
               <w:rPr>
                 <w:rFonts w:ascii="Times New Roman" w:eastAsia="Times New Roman" w:hAnsi="Times New Roman" w:cs="Times New Roman"/>
@@ -3154,7 +2844,6 @@
               </w:rPr>
               <w:t>Amit Pathak. 2024. SQLAlchemy Core - Creating Table. </w:t>
             </w:r>
-            <w:proofErr w:type="spellStart"/>
             <w:r>
               <w:rPr>
                 <w:rFonts w:ascii="Times New Roman" w:eastAsia="Times New Roman" w:hAnsi="Times New Roman" w:cs="Times New Roman"/>
@@ -3165,7 +2854,6 @@
               </w:rPr>
               <w:t>GeeksforGeeks</w:t>
             </w:r>
-            <w:proofErr w:type="spellEnd"/>
             <w:r>
               <w:rPr>
                 <w:rFonts w:ascii="Times New Roman" w:eastAsia="Times New Roman" w:hAnsi="Times New Roman" w:cs="Times New Roman"/>
@@ -3224,7 +2912,6 @@
               </w:rPr>
               <w:t>Kushwanth Reddy. 2025. Retrieving HTML Form data using Flask. </w:t>
             </w:r>
-            <w:proofErr w:type="spellStart"/>
             <w:r>
               <w:rPr>
                 <w:rFonts w:ascii="Times New Roman" w:eastAsia="Times New Roman" w:hAnsi="Times New Roman" w:cs="Times New Roman"/>
@@ -3235,7 +2922,6 @@
               </w:rPr>
               <w:t>GeeksforGeeks</w:t>
             </w:r>
-            <w:proofErr w:type="spellEnd"/>
             <w:r>
               <w:rPr>
                 <w:rFonts w:ascii="Times New Roman" w:eastAsia="Times New Roman" w:hAnsi="Times New Roman" w:cs="Times New Roman"/>
@@ -3294,7 +2980,6 @@
               </w:rPr>
               <w:t>Kartikeya Shukla. 2026. Introduction to Web development using Flask. </w:t>
             </w:r>
-            <w:proofErr w:type="spellStart"/>
             <w:r>
               <w:rPr>
                 <w:rFonts w:ascii="Times New Roman" w:eastAsia="Times New Roman" w:hAnsi="Times New Roman" w:cs="Times New Roman"/>
@@ -3305,7 +2990,6 @@
               </w:rPr>
               <w:t>GeeksforGeeks</w:t>
             </w:r>
-            <w:proofErr w:type="spellEnd"/>
             <w:r>
               <w:rPr>
                 <w:rFonts w:ascii="Times New Roman" w:eastAsia="Times New Roman" w:hAnsi="Times New Roman" w:cs="Times New Roman"/>
@@ -3364,7 +3048,6 @@
               </w:rPr>
               <w:t>Sachidanand Thakur. 2025. Creating Instance Objects in Python. </w:t>
             </w:r>
-            <w:proofErr w:type="spellStart"/>
             <w:r>
               <w:rPr>
                 <w:rFonts w:ascii="Times New Roman" w:eastAsia="Times New Roman" w:hAnsi="Times New Roman" w:cs="Times New Roman"/>
@@ -3375,7 +3058,6 @@
               </w:rPr>
               <w:t>GeeksforGeeks</w:t>
             </w:r>
-            <w:proofErr w:type="spellEnd"/>
             <w:r>
               <w:rPr>
                 <w:rFonts w:ascii="Times New Roman" w:eastAsia="Times New Roman" w:hAnsi="Times New Roman" w:cs="Times New Roman"/>
@@ -3494,25 +3176,14 @@
                 <w14:ligatures w14:val="none"/>
               </w:rPr>
             </w:pPr>
-            <w:proofErr w:type="spellStart"/>
-            <w:r>
-              <w:rPr>
-                <w:rFonts w:ascii="Times New Roman" w:eastAsia="Times New Roman" w:hAnsi="Times New Roman" w:cs="Times New Roman"/>
-                <w:kern w:val="0"/>
-                <w14:ligatures w14:val="none"/>
-              </w:rPr>
-              <w:t>TutorialsPoint</w:t>
-            </w:r>
-            <w:proofErr w:type="spellEnd"/>
-            <w:r>
-              <w:rPr>
-                <w:rFonts w:ascii="Times New Roman" w:eastAsia="Times New Roman" w:hAnsi="Times New Roman" w:cs="Times New Roman"/>
-                <w:kern w:val="0"/>
-                <w14:ligatures w14:val="none"/>
-              </w:rPr>
-              <w:t xml:space="preserve"> Team. SQLite - Commands. </w:t>
-            </w:r>
-            <w:proofErr w:type="spellStart"/>
+            <w:r>
+              <w:rPr>
+                <w:rFonts w:ascii="Times New Roman" w:eastAsia="Times New Roman" w:hAnsi="Times New Roman" w:cs="Times New Roman"/>
+                <w:kern w:val="0"/>
+                <w14:ligatures w14:val="none"/>
+              </w:rPr>
+              <w:t>TutorialsPoint Team. SQLite - Commands. </w:t>
+            </w:r>
             <w:r>
               <w:rPr>
                 <w:rFonts w:ascii="Times New Roman" w:eastAsia="Times New Roman" w:hAnsi="Times New Roman" w:cs="Times New Roman"/>
@@ -3523,7 +3194,6 @@
               </w:rPr>
               <w:t>tutorialspoint</w:t>
             </w:r>
-            <w:proofErr w:type="spellEnd"/>
             <w:r>
               <w:rPr>
                 <w:rFonts w:ascii="Times New Roman" w:eastAsia="Times New Roman" w:hAnsi="Times New Roman" w:cs="Times New Roman"/>
@@ -3582,7 +3252,6 @@
               </w:rPr>
               <w:t>Anish Singh Walia. 2020. How To Build a Web Application Using Flask in Python 3. </w:t>
             </w:r>
-            <w:proofErr w:type="spellStart"/>
             <w:r>
               <w:rPr>
                 <w:rFonts w:ascii="Times New Roman" w:eastAsia="Times New Roman" w:hAnsi="Times New Roman" w:cs="Times New Roman"/>
@@ -3593,7 +3262,6 @@
               </w:rPr>
               <w:t>DigitalOcean</w:t>
             </w:r>
-            <w:proofErr w:type="spellEnd"/>
             <w:r>
               <w:rPr>
                 <w:rFonts w:ascii="Times New Roman" w:eastAsia="Times New Roman" w:hAnsi="Times New Roman" w:cs="Times New Roman"/>
@@ -3652,7 +3320,6 @@
               </w:rPr>
               <w:t>Muhammad Waseem. 2024. Flask and Flask-Login: A Guide to Building Secure Web Applications. </w:t>
             </w:r>
-            <w:proofErr w:type="spellStart"/>
             <w:r>
               <w:rPr>
                 <w:rFonts w:ascii="Times New Roman" w:eastAsia="Times New Roman" w:hAnsi="Times New Roman" w:cs="Times New Roman"/>
@@ -3661,18 +3328,7 @@
                 <w:kern w:val="0"/>
                 <w14:ligatures w14:val="none"/>
               </w:rPr>
-              <w:t>Intersystems</w:t>
-            </w:r>
-            <w:proofErr w:type="spellEnd"/>
-            <w:r>
-              <w:rPr>
-                <w:rFonts w:ascii="Times New Roman" w:eastAsia="Times New Roman" w:hAnsi="Times New Roman" w:cs="Times New Roman"/>
-                <w:i/>
-                <w:iCs/>
-                <w:kern w:val="0"/>
-                <w14:ligatures w14:val="none"/>
-              </w:rPr>
-              <w:t xml:space="preserve"> Developer Community</w:t>
+              <w:t>Intersystems Developer Community</w:t>
             </w:r>
             <w:r>
               <w:rPr>
@@ -3709,21 +3365,7 @@
         <w:rPr>
           <w:rFonts w:ascii="Times New Roman" w:hAnsi="Times New Roman" w:cs="Times New Roman"/>
         </w:rPr>
-        <w:t>] “</w:t>
-      </w:r>
-      <w:proofErr w:type="spellStart"/>
-      <w:r>
-        <w:rPr>
-          <w:rFonts w:ascii="Times New Roman" w:hAnsi="Times New Roman" w:cs="Times New Roman"/>
-        </w:rPr>
-        <w:t>Concurrent.futures</w:t>
-      </w:r>
-      <w:proofErr w:type="spellEnd"/>
-      <w:r>
-        <w:rPr>
-          <w:rFonts w:ascii="Times New Roman" w:hAnsi="Times New Roman" w:cs="Times New Roman"/>
-        </w:rPr>
-        <w:t xml:space="preserve"> - launching parallel tasks,” Python documentation, https://docs.python.org/3/library/concurrent.futures.html (accessed May 12, 2026).  </w:t>
+        <w:t xml:space="preserve">] “Concurrent.futures - launching parallel tasks,” Python documentation, https://docs.python.org/3/library/concurrent.futures.html (accessed May 12, 2026).  </w:t>
       </w:r>
     </w:p>
     <w:p>

</xml_diff>